<commit_message>
feat: add 4D three-view planning and online terrain-following routes
</commit_message>
<xml_diff>
--- a/docs/AeroPlan航线生成算法与参数说明.docx
+++ b/docs/AeroPlan航线生成算法与参数说明.docx
@@ -22,7 +22,7 @@
     </w:p>
     <w:p>
       <w:r>
-        <w:t>代码基线 a1c1cb4  |  编制日期 2026年9月20日</w:t>
+        <w:t>技术版本 terrainAGL v2  |  更新日期 2026年9月20日</w:t>
       </w:r>
     </w:p>
     <w:p>
@@ -32,7 +32,7 @@
     </w:p>
     <w:p>
       <w:r>
-        <w:t>本文用于理解、复算和维护当前项目。它说明各参数如何影响结果，并给出可直接运行的调用示例。所有“已实现”描述均对应上述代码版本。</w:t>
+        <w:t>本文用于理解、复算和维护当前项目。v2 增加 4D 正射三向智能摆拍的采集意图，并将航高改为固定离地高度 AGL。水平路线生成后，对全部航段和拍照站点采样在线地形，得到逐点绝对高程。</w:t>
       </w:r>
     </w:p>
     <w:p>
@@ -45,7 +45,7 @@
     </w:p>
     <w:p>
       <w:r>
-        <w:t>当前结果是平面参考条件下的采集预规划。系统以统一的最高建筑高度计算拍摄间距，尚未使用 DSM 校核建筑遮挡和三维障碍物，因此不能据此保证真正射影像完整性，也不生成可直接下发大疆机场的飞行任务。</w:t>
+        <w:t>当前结果仍是采集预规划。足迹和重叠率按水平地面近似；在线 DEM 提供地形高程，不包含完整建筑 DSM。三向模式按用户角度建立近似姿态，不虚构原生曝光时序，也不以未经证实的侧向覆盖减少航线。结果不等于可直接下发机场的任务。</w:t>
       </w:r>
     </w:p>
     <w:tbl>
@@ -283,7 +283,7 @@
                 <w:b w:val="0"/>
                 <w:sz w:val="18"/>
               </w:rPr>
-              <w:t>第 10 至 11 章  拍照点 统计 输出与导出</w:t>
+              <w:t>第 10 至 13 章  三向姿态 地形高程 统计与导出</w:t>
             </w:r>
           </w:p>
         </w:tc>
@@ -338,7 +338,7 @@
                 <w:b w:val="0"/>
                 <w:sz w:val="18"/>
               </w:rPr>
-              <w:t>第 12 至 14 章  算例 错误边界 代码与测试</w:t>
+              <w:t>第 14 至 16 章  算例 错误边界 代码与测试</w:t>
             </w:r>
           </w:p>
         </w:tc>
@@ -359,12 +359,12 @@
     </w:p>
     <w:p>
       <w:r>
-        <w:t>参数与多边形校验 → 局部投影 → 相机足迹和间距 → 候选航向扫描 → 航向选择 → 平面足迹补线 → 边界内连接 → 拍照点插值 → 距离时间统计 → 经纬度输出。</w:t>
+        <w:t>参数与多边形校验 → 局部投影 → 下视足迹和间距 → 航向选择与扫描 → 平面补线 → 区内连接 → 采集站点与模式意图 → 路线加密 → 在线地形采样 → 逐点赋高 → 三维距离和时间统计。</w:t>
       </w:r>
     </w:p>
     <w:p>
       <w:r>
-        <w:t>机场在楼顶时，必须统一测区参考地面、建筑高度和机场高度的基准。机场位置目前仅用于界面展示和方案保存，没有进入区内航线优化。</w:t>
+        <w:t>高度只由“地形高程＋设定离地高度”确定。机场位于楼顶不会改变区内间距或逐点高程；机场进出、返航和楼顶障碍物仍须单独规划。</w:t>
       </w:r>
     </w:p>
     <w:p>
@@ -603,7 +603,7 @@
                 <w:b w:val="0"/>
                 <w:sz w:val="18"/>
               </w:rPr>
-              <w:t>altitude</w:t>
+              <w:t>captureMode</w:t>
             </w:r>
           </w:p>
         </w:tc>
@@ -628,7 +628,7 @@
                 <w:b w:val="0"/>
                 <w:sz w:val="18"/>
               </w:rPr>
-              <w:t>100</w:t>
+              <w:t>nadir</w:t>
             </w:r>
           </w:p>
         </w:tc>
@@ -653,7 +653,7 @@
                 <w:b w:val="0"/>
                 <w:sz w:val="18"/>
               </w:rPr>
-              <w:t>m  相对参考地面的航高  0 &lt; H ≤ 1000</w:t>
+              <w:t>nadir 下视 / smartOrtho 三向意图  后者仅限 4D</w:t>
             </w:r>
           </w:p>
         </w:tc>
@@ -683,7 +683,7 @@
                 <w:b w:val="0"/>
                 <w:sz w:val="18"/>
               </w:rPr>
-              <w:t>buildingHeight</w:t>
+              <w:t>altitude</w:t>
             </w:r>
           </w:p>
         </w:tc>
@@ -708,7 +708,7 @@
                 <w:b w:val="0"/>
                 <w:sz w:val="18"/>
               </w:rPr>
-              <w:t>40</w:t>
+              <w:t>100</w:t>
             </w:r>
           </w:p>
         </w:tc>
@@ -733,7 +733,7 @@
                 <w:b w:val="0"/>
                 <w:sz w:val="18"/>
               </w:rPr>
-              <w:t>m  最高建筑高度  ≥ 0</w:t>
+              <w:t>m  固定离地高度 AGL  0 &lt; H ≤ 1000</w:t>
             </w:r>
           </w:p>
         </w:tc>
@@ -763,7 +763,7 @@
                 <w:b w:val="0"/>
                 <w:sz w:val="18"/>
               </w:rPr>
-              <w:t>dockHeight</w:t>
+              <w:t>smartPitch</w:t>
             </w:r>
           </w:p>
         </w:tc>
@@ -788,7 +788,7 @@
                 <w:b w:val="0"/>
                 <w:sz w:val="18"/>
               </w:rPr>
-              <w:t>40</w:t>
+              <w:t>−62.5</w:t>
             </w:r>
           </w:p>
         </w:tc>
@@ -813,7 +813,7 @@
                 <w:b w:val="0"/>
                 <w:sz w:val="18"/>
               </w:rPr>
-              <w:t>m  机场高度  ≥ 0</w:t>
+              <w:t>°  左右侧视俯仰  −65 至 −60</w:t>
             </w:r>
           </w:p>
         </w:tc>
@@ -843,7 +843,7 @@
                 <w:b w:val="0"/>
                 <w:sz w:val="18"/>
               </w:rPr>
-              <w:t>clearance</w:t>
+              <w:t>smartYaw</w:t>
             </w:r>
           </w:p>
         </w:tc>
@@ -868,7 +868,7 @@
                 <w:b w:val="0"/>
                 <w:sz w:val="18"/>
               </w:rPr>
-              <w:t>20</w:t>
+              <w:t>27.5</w:t>
             </w:r>
           </w:p>
         </w:tc>
@@ -893,7 +893,7 @@
                 <w:b w:val="0"/>
                 <w:sz w:val="18"/>
               </w:rPr>
-              <w:t>m  要求的垂直净空  ≥ 0</w:t>
+              <w:t>°  左右相对偏航幅度  25 至 30  横滚固定 0</w:t>
             </w:r>
           </w:p>
         </w:tc>
@@ -923,7 +923,7 @@
                 <w:b w:val="0"/>
                 <w:sz w:val="18"/>
               </w:rPr>
-              <w:t>frontOverlap</w:t>
+              <w:t>terrainSampleSpacing</w:t>
             </w:r>
           </w:p>
         </w:tc>
@@ -948,6 +948,86 @@
                 <w:b w:val="0"/>
                 <w:sz w:val="18"/>
               </w:rPr>
+              <w:t>30</w:t>
+            </w:r>
+          </w:p>
+        </w:tc>
+        <w:tc>
+          <w:tcPr>
+            <w:tcW w:type="dxa" w:w="6180"/>
+            <w:vAlign w:val="center"/>
+            <w:tcMar>
+              <w:top w:w="75" w:type="dxa"/>
+              <w:bottom w:w="75" w:type="dxa"/>
+              <w:left w:w="75" w:type="dxa"/>
+              <w:right w:w="75" w:type="dxa"/>
+            </w:tcMar>
+            <w:shd w:fill="F4F7FA"/>
+          </w:tcPr>
+          <w:p>
+            <w:pPr>
+              <w:spacing w:after="20" w:line="259" w:lineRule="auto"/>
+            </w:pPr>
+            <w:r>
+              <w:rPr>
+                <w:b w:val="0"/>
+                <w:sz w:val="18"/>
+              </w:rPr>
+              <w:t>m  航线最大水平采样间距  5 至 100</w:t>
+            </w:r>
+          </w:p>
+        </w:tc>
+      </w:tr>
+      <w:tr>
+        <w:trPr>
+          <w:cantSplit/>
+        </w:trPr>
+        <w:tc>
+          <w:tcPr>
+            <w:tcW w:type="dxa" w:w="2324"/>
+            <w:vAlign w:val="center"/>
+            <w:tcMar>
+              <w:top w:w="75" w:type="dxa"/>
+              <w:bottom w:w="75" w:type="dxa"/>
+              <w:left w:w="75" w:type="dxa"/>
+              <w:right w:w="75" w:type="dxa"/>
+            </w:tcMar>
+            <w:shd w:fill="FFFFFF"/>
+          </w:tcPr>
+          <w:p>
+            <w:pPr>
+              <w:spacing w:after="20" w:line="259" w:lineRule="auto"/>
+            </w:pPr>
+            <w:r>
+              <w:rPr>
+                <w:b w:val="0"/>
+                <w:sz w:val="18"/>
+              </w:rPr>
+              <w:t>frontOverlap</w:t>
+            </w:r>
+          </w:p>
+        </w:tc>
+        <w:tc>
+          <w:tcPr>
+            <w:tcW w:type="dxa" w:w="1247"/>
+            <w:vAlign w:val="center"/>
+            <w:tcMar>
+              <w:top w:w="75" w:type="dxa"/>
+              <w:bottom w:w="75" w:type="dxa"/>
+              <w:left w:w="75" w:type="dxa"/>
+              <w:right w:w="75" w:type="dxa"/>
+            </w:tcMar>
+            <w:shd w:fill="FFFFFF"/>
+          </w:tcPr>
+          <w:p>
+            <w:pPr>
+              <w:spacing w:after="20" w:line="259" w:lineRule="auto"/>
+            </w:pPr>
+            <w:r>
+              <w:rPr>
+                <w:b w:val="0"/>
+                <w:sz w:val="18"/>
+              </w:rPr>
               <w:t>85</w:t>
             </w:r>
           </w:p>
@@ -962,7 +1042,7 @@
               <w:left w:w="75" w:type="dxa"/>
               <w:right w:w="75" w:type="dxa"/>
             </w:tcMar>
-            <w:shd w:fill="F4F7FA"/>
+            <w:shd w:fill="FFFFFF"/>
           </w:tcPr>
           <w:p>
             <w:pPr>
@@ -992,7 +1072,7 @@
               <w:left w:w="75" w:type="dxa"/>
               <w:right w:w="75" w:type="dxa"/>
             </w:tcMar>
-            <w:shd w:fill="FFFFFF"/>
+            <w:shd w:fill="F4F7FA"/>
           </w:tcPr>
           <w:p>
             <w:pPr>
@@ -1017,7 +1097,7 @@
               <w:left w:w="75" w:type="dxa"/>
               <w:right w:w="75" w:type="dxa"/>
             </w:tcMar>
-            <w:shd w:fill="FFFFFF"/>
+            <w:shd w:fill="F4F7FA"/>
           </w:tcPr>
           <w:p>
             <w:pPr>
@@ -1042,7 +1122,7 @@
               <w:left w:w="75" w:type="dxa"/>
               <w:right w:w="75" w:type="dxa"/>
             </w:tcMar>
-            <w:shd w:fill="FFFFFF"/>
+            <w:shd w:fill="F4F7FA"/>
           </w:tcPr>
           <w:p>
             <w:pPr>
@@ -1072,7 +1152,7 @@
               <w:left w:w="75" w:type="dxa"/>
               <w:right w:w="75" w:type="dxa"/>
             </w:tcMar>
-            <w:shd w:fill="F4F7FA"/>
+            <w:shd w:fill="FFFFFF"/>
           </w:tcPr>
           <w:p>
             <w:pPr>
@@ -1097,7 +1177,7 @@
               <w:left w:w="75" w:type="dxa"/>
               <w:right w:w="75" w:type="dxa"/>
             </w:tcMar>
-            <w:shd w:fill="F4F7FA"/>
+            <w:shd w:fill="FFFFFF"/>
           </w:tcPr>
           <w:p>
             <w:pPr>
@@ -1122,7 +1202,7 @@
               <w:left w:w="75" w:type="dxa"/>
               <w:right w:w="75" w:type="dxa"/>
             </w:tcMar>
-            <w:shd w:fill="F4F7FA"/>
+            <w:shd w:fill="FFFFFF"/>
           </w:tcPr>
           <w:p>
             <w:pPr>
@@ -1152,7 +1232,7 @@
               <w:left w:w="75" w:type="dxa"/>
               <w:right w:w="75" w:type="dxa"/>
             </w:tcMar>
-            <w:shd w:fill="FFFFFF"/>
+            <w:shd w:fill="F4F7FA"/>
           </w:tcPr>
           <w:p>
             <w:pPr>
@@ -1177,7 +1257,7 @@
               <w:left w:w="75" w:type="dxa"/>
               <w:right w:w="75" w:type="dxa"/>
             </w:tcMar>
-            <w:shd w:fill="FFFFFF"/>
+            <w:shd w:fill="F4F7FA"/>
           </w:tcPr>
           <w:p>
             <w:pPr>
@@ -1202,7 +1282,7 @@
               <w:left w:w="75" w:type="dxa"/>
               <w:right w:w="75" w:type="dxa"/>
             </w:tcMar>
-            <w:shd w:fill="FFFFFF"/>
+            <w:shd w:fill="F4F7FA"/>
           </w:tcPr>
           <w:p>
             <w:pPr>
@@ -1232,7 +1312,7 @@
               <w:left w:w="75" w:type="dxa"/>
               <w:right w:w="75" w:type="dxa"/>
             </w:tcMar>
-            <w:shd w:fill="F4F7FA"/>
+            <w:shd w:fill="FFFFFF"/>
           </w:tcPr>
           <w:p>
             <w:pPr>
@@ -1257,7 +1337,7 @@
               <w:left w:w="75" w:type="dxa"/>
               <w:right w:w="75" w:type="dxa"/>
             </w:tcMar>
-            <w:shd w:fill="F4F7FA"/>
+            <w:shd w:fill="FFFFFF"/>
           </w:tcPr>
           <w:p>
             <w:pPr>
@@ -1282,7 +1362,7 @@
               <w:left w:w="75" w:type="dxa"/>
               <w:right w:w="75" w:type="dxa"/>
             </w:tcMar>
-            <w:shd w:fill="F4F7FA"/>
+            <w:shd w:fill="FFFFFF"/>
           </w:tcPr>
           <w:p>
             <w:pPr>
@@ -1312,7 +1392,7 @@
               <w:left w:w="75" w:type="dxa"/>
               <w:right w:w="75" w:type="dxa"/>
             </w:tcMar>
-            <w:shd w:fill="FFFFFF"/>
+            <w:shd w:fill="F4F7FA"/>
           </w:tcPr>
           <w:p>
             <w:pPr>
@@ -1337,7 +1417,7 @@
               <w:left w:w="75" w:type="dxa"/>
               <w:right w:w="75" w:type="dxa"/>
             </w:tcMar>
-            <w:shd w:fill="FFFFFF"/>
+            <w:shd w:fill="F4F7FA"/>
           </w:tcPr>
           <w:p>
             <w:pPr>
@@ -1362,7 +1442,7 @@
               <w:left w:w="75" w:type="dxa"/>
               <w:right w:w="75" w:type="dxa"/>
             </w:tcMar>
-            <w:shd w:fill="FFFFFF"/>
+            <w:shd w:fill="F4F7FA"/>
           </w:tcPr>
           <w:p>
             <w:pPr>
@@ -1392,7 +1472,7 @@
               <w:left w:w="75" w:type="dxa"/>
               <w:right w:w="75" w:type="dxa"/>
             </w:tcMar>
-            <w:shd w:fill="F4F7FA"/>
+            <w:shd w:fill="FFFFFF"/>
           </w:tcPr>
           <w:p>
             <w:pPr>
@@ -1417,7 +1497,7 @@
               <w:left w:w="75" w:type="dxa"/>
               <w:right w:w="75" w:type="dxa"/>
             </w:tcMar>
-            <w:shd w:fill="F4F7FA"/>
+            <w:shd w:fill="FFFFFF"/>
           </w:tcPr>
           <w:p>
             <w:pPr>
@@ -1442,7 +1522,7 @@
               <w:left w:w="75" w:type="dxa"/>
               <w:right w:w="75" w:type="dxa"/>
             </w:tcMar>
-            <w:shd w:fill="F4F7FA"/>
+            <w:shd w:fill="FFFFFF"/>
           </w:tcPr>
           <w:p>
             <w:pPr>
@@ -1474,22 +1554,33 @@
         <w:pStyle w:val="Heading2"/>
       </w:pPr>
       <w:r>
-        <w:t>参数之间的联合约束</w:t>
+        <w:t>兼容与两阶段计算</w:t>
+      </w:r>
+    </w:p>
+    <w:p>
+      <w:r>
+        <w:t>buildingHeight、dockHeight、clearance 为旧版本参数，读取旧方案时不再参与计算；屋顶 GSD、建筑净空和相对机场高度统计已移除。目标 GSD 仍由 AGL 反算。4TD 不能选择 smartOrtho。</w:t>
       </w:r>
     </w:p>
     <w:p>
       <w:pPr>
-        <w:spacing w:after="140"/>
+        <w:spacing w:line="252" w:lineRule="auto"/>
       </w:pPr>
-      <m:oMath>
-        <m:r>
-          <m:t>H − B &gt; 0     且     H − B ≥ clearance</m:t>
-        </m:r>
-      </m:oMath>
+      <w:r>
+        <w:rPr>
+          <w:rFonts w:ascii="Consolas" w:hAnsi="Consolas"/>
+          <w:sz w:val="18"/>
+        </w:rPr>
+        <w:t>horizontal = planMission(ringLL, options, holesLL)</w:t>
+        <w:br/>
+        <w:t>plan = await attachTerrainToPlan(</w:t>
+        <w:br/>
+        <w:t xml:space="preserve">  horizontal, options, sampleHeights, metadata)</w:t>
+      </w:r>
     </w:p>
     <w:p>
       <w:r>
-        <w:t>H 表示 altitude，B 表示 buildingHeight。净空不满足时立即报错；机场高度高于航高只触发提示，不会阻止生成区内航线。目标 GSD 目前不是独立输入，系统由航高反算 GSD。</w:t>
+        <w:t>planMission 返回 terrain.status="pending" 的二维中间结果。attachTerrainToPlan 接收按输入顺序返回高程数组的异步采样函数，全部高程有效才返回 ready；网页仅允许导出 ready 的完整方案。</w:t>
       </w:r>
     </w:p>
     <w:p>
@@ -1995,7 +2086,7 @@
         <w:pStyle w:val="Heading2"/>
       </w:pPr>
       <w:r>
-        <w:t>统一的高度参考</w:t>
+        <w:t>离地高度与绝对高程</w:t>
       </w:r>
     </w:p>
     <w:p>
@@ -2004,23 +2095,18 @@
       </w:pPr>
       <m:oMath>
         <m:r>
-          <m:t>最高建筑上方高度 h = altitude − buildingHeight</m:t>
-        </m:r>
-      </m:oMath>
-    </w:p>
-    <w:p>
-      <w:pPr>
-        <w:spacing w:after="140"/>
-      </w:pPr>
-      <m:oMath>
-        <m:r>
-          <m:t>相对机场高度 = altitude − dockHeight</m:t>
+          <m:t>z飞行(经度,纬度) = z地形(经度,纬度) + altitude</m:t>
         </m:r>
       </m:oMath>
     </w:p>
     <w:p>
       <w:r>
-        <w:t>三项高度都相对同一测区参考地面。它们不是椭球高、海拔高或自动读取的地形高。机场位于屋顶时，不能直接把测区对地航高当成机场起飞点的相对高度。当前算法不求解机场至测区的爬升、下降或返航路径。</w:t>
+        <w:t>altitude 是飞机相对下方地形的垂直距离，不是相对机场高度，也不是一个全区不变的绝对高程。z飞行随地形变化，保留地形源原始垂直基准。在线源是多源地形高程，未统一转换为椭球高，不能标注成已校准的 EGM96 或 CGCS2000 高程。</w:t>
+      </w:r>
+    </w:p>
+    <w:p>
+      <w:r>
+        <w:t>EPSG:4490 约定水平经纬度，不能单独说明第三个坐标的垂直基准。地形原始高程在 Cesium 中仅作三维位置近似显示；测绘或飞行执行前需完成垂直基准转换和现场核对。</w:t>
       </w:r>
     </w:p>
     <w:p>
@@ -2033,7 +2119,7 @@
     </w:p>
     <w:p>
       <w:r>
-        <w:t>网页控件设置得更窄：航高 20–500 m、速度 1–15 m/s、航向重叠率 60%–95%、建筑和机场高度 0–500 m、净空 5–200 m、手动方向 0°–175°。通过程序调用时，第 2 章引擎约束才是最终校验规则。</w:t>
+        <w:t>网页控件可比引擎校验更窄；程序调用以第 2 章约束为准。采样间距是路线加密尺度，不是 DEM 分辨率或精度。减小间距只能增加采样位置，不能恢复地形源中不存在的楼宇、细线或地形细节。</w:t>
       </w:r>
     </w:p>
     <w:p>
@@ -2170,7 +2256,7 @@
     </w:p>
     <w:p>
       <w:r>
-        <w:t>假设相机垂直向下、成像面平行于水平参考面，照片长边横跨航线、短边沿航线。设像素宽高为 Nw、Nh，对角视场角为 α，地面航高为 H，最高建筑高度为 B。</w:t>
+        <w:t>以下模型用于下视摄影，也作为三向意图的保守布线基线。假设相机垂直向下、地面局部水平，照片长边横跨航线、短边沿航线。设像素宽高 Nw、Nh，对角视场角 α，固定离地高度 H=altitude。</w:t>
       </w:r>
     </w:p>
     <w:p>
@@ -2211,7 +2297,7 @@
         <w:pStyle w:val="Heading2"/>
       </w:pPr>
       <w:r>
-        <w:t>步骤二 求地面与屋顶名义分辨率</w:t>
+        <w:t>步骤二 求地形表面名义分辨率</w:t>
       </w:r>
     </w:p>
     <w:p>
@@ -2225,18 +2311,8 @@
       </m:oMath>
     </w:p>
     <w:p>
-      <w:pPr>
-        <w:spacing w:after="140"/>
-      </w:pPr>
-      <m:oMath>
-        <m:r>
-          <m:t>roofGsdCm = 100 (H − B) k</m:t>
-        </m:r>
-      </m:oMath>
-    </w:p>
-    <w:p>
       <w:r>
-        <w:t>两个输出单位均为 cm/px。由于屋顶更接近相机，其足迹更小；项目使用最高建筑平面决定间距，用来避免只按地面足迹布线造成屋顶重叠不足。</w:t>
+        <w:t>单位为 cm/px。这是下视相机在水平地面的名义值，不是地形坡面每个位置的真实 GSD，也不代表三向摆拍侧视影像的 GSD。系统不再减去统一建筑高度。</w:t>
       </w:r>
     </w:p>
     <w:p>
@@ -2244,7 +2320,7 @@
         <w:pStyle w:val="Heading2"/>
       </w:pPr>
       <w:r>
-        <w:t>步骤三 求屋顶足迹和目标间距</w:t>
+        <w:t>步骤三 求下视足迹和目标间距</w:t>
       </w:r>
     </w:p>
     <w:p>
@@ -2253,7 +2329,7 @@
       </w:pPr>
       <m:oMath>
         <m:r>
-          <m:t>W = (H − B) k Nw     L = (H − B) k Nh</m:t>
+          <m:t>W = H k Nw     L = H k Nh</m:t>
         </m:r>
       </m:oMath>
     </w:p>
@@ -2292,7 +2368,7 @@
     </w:p>
     <w:p>
       <w:r>
-        <w:t>增加建筑高度或提高重叠率会减小间距，通常增加航段数和照片量。提高航高会扩大足迹、增大 GSD；调整速度不改变拍照点数量，但会改变时间估算和拍摄间隔提示。对复杂边界，航段数和时间可能出现离散跳变。</w:t>
+        <w:t>提高重叠率会减小间距并通常增加站点数；提高 AGL 会扩大足迹、增大名义 GSD。选择三向模式保留相同行距与站距，增加三向采集意图和预算照片数；不承诺复刻 DJI 原生稀疏航线效率。速度影响时间，通常不改变站点位置。</w:t>
       </w:r>
     </w:p>
     <w:p>
@@ -2927,7 +3003,7 @@
     </w:p>
     <w:p>
       <w:r>
-        <w:t>L 和 W 来自第 5 章屋顶足迹。因为拍照点包含航段两端，且实际沿线点距不大于足迹长度，在固定平面、固定朝向模型内，这一串照片足迹的并集是连续矩形。矩形可以延伸到飞行边界或孔洞之外。</w:t>
+        <w:t>L 和 W 来自第 5 章 AGL 下视足迹。采集站点包含航段两端，且沿线间距不大于足迹长度，因此在固定水平面、固定朝向模型内，照片足迹并集是连续矩形。它可以延伸到飞行边界或孔洞之外。</w:t>
       </w:r>
     </w:p>
     <w:p>
@@ -3101,20 +3177,473 @@
         <w:pStyle w:val="Heading1"/>
       </w:pPr>
       <w:r>
-        <w:t>10 拍照点与任务统计</w:t>
+        <w:t>10 三向近似姿态与足迹</w:t>
       </w:r>
+    </w:p>
+    <w:p>
+      <w:r>
+        <w:t>captureMode="smartOrtho" 仅允许 4D。该模式按用户确认的近似角度生成相机模型，不将近似角度冒充 DJI 固件指令。中间向下，左右使用偏航角，横滚均为 0°。</w:t>
+      </w:r>
+    </w:p>
+    <w:tbl>
+      <w:tblPr>
+        <w:tblW w:type="auto" w:w="0"/>
+        <w:jc w:val="center"/>
+        <w:tblLayout w:type="fixed"/>
+        <w:tblLook w:firstColumn="1" w:firstRow="1" w:lastColumn="0" w:lastRow="0" w:noHBand="0" w:noVBand="1" w:val="04A0"/>
+        <w:tblBorders>
+          <w:top w:val="single" w:sz="4" w:color="D9D9D9"/>
+          <w:left w:val="single" w:sz="4" w:color="D9D9D9"/>
+          <w:bottom w:val="single" w:sz="4" w:color="D9D9D9"/>
+          <w:right w:val="single" w:sz="4" w:color="D9D9D9"/>
+          <w:insideH w:val="single" w:sz="4" w:color="D9D9D9"/>
+          <w:insideV w:val="single" w:sz="4" w:color="D9D9D9"/>
+        </w:tblBorders>
+      </w:tblPr>
+      <w:tblGrid>
+        <w:gridCol w:w="1134"/>
+        <w:gridCol w:w="3515"/>
+        <w:gridCol w:w="3969"/>
+        <w:gridCol w:w="1134"/>
+      </w:tblGrid>
+      <w:tr>
+        <w:trPr>
+          <w:cantSplit/>
+          <w:tblHeader/>
+        </w:trPr>
+        <w:tc>
+          <w:tcPr>
+            <w:tcW w:type="dxa" w:w="1134"/>
+            <w:vAlign w:val="center"/>
+            <w:tcMar>
+              <w:top w:w="75" w:type="dxa"/>
+              <w:bottom w:w="75" w:type="dxa"/>
+              <w:left w:w="75" w:type="dxa"/>
+              <w:right w:w="75" w:type="dxa"/>
+            </w:tcMar>
+            <w:shd w:fill="DBE5EE"/>
+          </w:tcPr>
+          <w:p>
+            <w:pPr>
+              <w:spacing w:after="20" w:line="259" w:lineRule="auto"/>
+            </w:pPr>
+            <w:r>
+              <w:rPr>
+                <w:b/>
+                <w:sz w:val="18"/>
+              </w:rPr>
+              <w:t>方向</w:t>
+            </w:r>
+          </w:p>
+        </w:tc>
+        <w:tc>
+          <w:tcPr>
+            <w:tcW w:type="dxa" w:w="3515"/>
+            <w:vAlign w:val="center"/>
+            <w:tcMar>
+              <w:top w:w="75" w:type="dxa"/>
+              <w:bottom w:w="75" w:type="dxa"/>
+              <w:left w:w="75" w:type="dxa"/>
+              <w:right w:w="75" w:type="dxa"/>
+            </w:tcMar>
+            <w:shd w:fill="DBE5EE"/>
+          </w:tcPr>
+          <w:p>
+            <w:pPr>
+              <w:spacing w:after="20" w:line="259" w:lineRule="auto"/>
+            </w:pPr>
+            <w:r>
+              <w:rPr>
+                <w:b/>
+                <w:sz w:val="18"/>
+              </w:rPr>
+              <w:t>俯仰角</w:t>
+            </w:r>
+          </w:p>
+        </w:tc>
+        <w:tc>
+          <w:tcPr>
+            <w:tcW w:type="dxa" w:w="3969"/>
+            <w:vAlign w:val="center"/>
+            <w:tcMar>
+              <w:top w:w="75" w:type="dxa"/>
+              <w:bottom w:w="75" w:type="dxa"/>
+              <w:left w:w="75" w:type="dxa"/>
+              <w:right w:w="75" w:type="dxa"/>
+            </w:tcMar>
+            <w:shd w:fill="DBE5EE"/>
+          </w:tcPr>
+          <w:p>
+            <w:pPr>
+              <w:spacing w:after="20" w:line="259" w:lineRule="auto"/>
+            </w:pPr>
+            <w:r>
+              <w:rPr>
+                <w:b/>
+                <w:sz w:val="18"/>
+              </w:rPr>
+              <w:t>相对航段偏航</w:t>
+            </w:r>
+          </w:p>
+        </w:tc>
+        <w:tc>
+          <w:tcPr>
+            <w:tcW w:type="dxa" w:w="1134"/>
+            <w:vAlign w:val="center"/>
+            <w:tcMar>
+              <w:top w:w="75" w:type="dxa"/>
+              <w:bottom w:w="75" w:type="dxa"/>
+              <w:left w:w="75" w:type="dxa"/>
+              <w:right w:w="75" w:type="dxa"/>
+            </w:tcMar>
+            <w:shd w:fill="DBE5EE"/>
+          </w:tcPr>
+          <w:p>
+            <w:pPr>
+              <w:spacing w:after="20" w:line="259" w:lineRule="auto"/>
+            </w:pPr>
+            <w:r>
+              <w:rPr>
+                <w:b/>
+                <w:sz w:val="18"/>
+              </w:rPr>
+              <w:t>横滚</w:t>
+            </w:r>
+          </w:p>
+        </w:tc>
+      </w:tr>
+      <w:tr>
+        <w:trPr>
+          <w:cantSplit/>
+        </w:trPr>
+        <w:tc>
+          <w:tcPr>
+            <w:tcW w:type="dxa" w:w="1134"/>
+            <w:vAlign w:val="center"/>
+            <w:tcMar>
+              <w:top w:w="75" w:type="dxa"/>
+              <w:bottom w:w="75" w:type="dxa"/>
+              <w:left w:w="75" w:type="dxa"/>
+              <w:right w:w="75" w:type="dxa"/>
+            </w:tcMar>
+            <w:shd w:fill="FFFFFF"/>
+          </w:tcPr>
+          <w:p>
+            <w:pPr>
+              <w:spacing w:after="20" w:line="259" w:lineRule="auto"/>
+            </w:pPr>
+            <w:r>
+              <w:rPr>
+                <w:b w:val="0"/>
+                <w:sz w:val="18"/>
+              </w:rPr>
+              <w:t>左侧</w:t>
+            </w:r>
+          </w:p>
+        </w:tc>
+        <w:tc>
+          <w:tcPr>
+            <w:tcW w:type="dxa" w:w="3515"/>
+            <w:vAlign w:val="center"/>
+            <w:tcMar>
+              <w:top w:w="75" w:type="dxa"/>
+              <w:bottom w:w="75" w:type="dxa"/>
+              <w:left w:w="75" w:type="dxa"/>
+              <w:right w:w="75" w:type="dxa"/>
+            </w:tcMar>
+            <w:shd w:fill="FFFFFF"/>
+          </w:tcPr>
+          <w:p>
+            <w:pPr>
+              <w:spacing w:after="20" w:line="259" w:lineRule="auto"/>
+            </w:pPr>
+            <w:r>
+              <w:rPr>
+                <w:b w:val="0"/>
+                <w:sz w:val="18"/>
+              </w:rPr>
+              <w:t>−62.5°  可调 −65° 至 −60°</w:t>
+            </w:r>
+          </w:p>
+        </w:tc>
+        <w:tc>
+          <w:tcPr>
+            <w:tcW w:type="dxa" w:w="3969"/>
+            <w:vAlign w:val="center"/>
+            <w:tcMar>
+              <w:top w:w="75" w:type="dxa"/>
+              <w:bottom w:w="75" w:type="dxa"/>
+              <w:left w:w="75" w:type="dxa"/>
+              <w:right w:w="75" w:type="dxa"/>
+            </w:tcMar>
+            <w:shd w:fill="FFFFFF"/>
+          </w:tcPr>
+          <w:p>
+            <w:pPr>
+              <w:spacing w:after="20" w:line="259" w:lineRule="auto"/>
+            </w:pPr>
+            <w:r>
+              <w:rPr>
+                <w:b w:val="0"/>
+                <w:sz w:val="18"/>
+              </w:rPr>
+              <w:t>−27.5°  幅度可调 25° 至 30°</w:t>
+            </w:r>
+          </w:p>
+        </w:tc>
+        <w:tc>
+          <w:tcPr>
+            <w:tcW w:type="dxa" w:w="1134"/>
+            <w:vAlign w:val="center"/>
+            <w:tcMar>
+              <w:top w:w="75" w:type="dxa"/>
+              <w:bottom w:w="75" w:type="dxa"/>
+              <w:left w:w="75" w:type="dxa"/>
+              <w:right w:w="75" w:type="dxa"/>
+            </w:tcMar>
+            <w:shd w:fill="FFFFFF"/>
+          </w:tcPr>
+          <w:p>
+            <w:pPr>
+              <w:spacing w:after="20" w:line="259" w:lineRule="auto"/>
+            </w:pPr>
+            <w:r>
+              <w:rPr>
+                <w:b w:val="0"/>
+                <w:sz w:val="18"/>
+              </w:rPr>
+              <w:t>0°</w:t>
+            </w:r>
+          </w:p>
+        </w:tc>
+      </w:tr>
+      <w:tr>
+        <w:trPr>
+          <w:cantSplit/>
+        </w:trPr>
+        <w:tc>
+          <w:tcPr>
+            <w:tcW w:type="dxa" w:w="1134"/>
+            <w:vAlign w:val="center"/>
+            <w:tcMar>
+              <w:top w:w="75" w:type="dxa"/>
+              <w:bottom w:w="75" w:type="dxa"/>
+              <w:left w:w="75" w:type="dxa"/>
+              <w:right w:w="75" w:type="dxa"/>
+            </w:tcMar>
+            <w:shd w:fill="F4F7FA"/>
+          </w:tcPr>
+          <w:p>
+            <w:pPr>
+              <w:spacing w:after="20" w:line="259" w:lineRule="auto"/>
+            </w:pPr>
+            <w:r>
+              <w:rPr>
+                <w:b w:val="0"/>
+                <w:sz w:val="18"/>
+              </w:rPr>
+              <w:t>中间</w:t>
+            </w:r>
+          </w:p>
+        </w:tc>
+        <w:tc>
+          <w:tcPr>
+            <w:tcW w:type="dxa" w:w="3515"/>
+            <w:vAlign w:val="center"/>
+            <w:tcMar>
+              <w:top w:w="75" w:type="dxa"/>
+              <w:bottom w:w="75" w:type="dxa"/>
+              <w:left w:w="75" w:type="dxa"/>
+              <w:right w:w="75" w:type="dxa"/>
+            </w:tcMar>
+            <w:shd w:fill="F4F7FA"/>
+          </w:tcPr>
+          <w:p>
+            <w:pPr>
+              <w:spacing w:after="20" w:line="259" w:lineRule="auto"/>
+            </w:pPr>
+            <w:r>
+              <w:rPr>
+                <w:b w:val="0"/>
+                <w:sz w:val="18"/>
+              </w:rPr>
+              <w:t>−90°</w:t>
+            </w:r>
+          </w:p>
+        </w:tc>
+        <w:tc>
+          <w:tcPr>
+            <w:tcW w:type="dxa" w:w="3969"/>
+            <w:vAlign w:val="center"/>
+            <w:tcMar>
+              <w:top w:w="75" w:type="dxa"/>
+              <w:bottom w:w="75" w:type="dxa"/>
+              <w:left w:w="75" w:type="dxa"/>
+              <w:right w:w="75" w:type="dxa"/>
+            </w:tcMar>
+            <w:shd w:fill="F4F7FA"/>
+          </w:tcPr>
+          <w:p>
+            <w:pPr>
+              <w:spacing w:after="20" w:line="259" w:lineRule="auto"/>
+            </w:pPr>
+            <w:r>
+              <w:rPr>
+                <w:b w:val="0"/>
+                <w:sz w:val="18"/>
+              </w:rPr>
+              <w:t>0°</w:t>
+            </w:r>
+          </w:p>
+        </w:tc>
+        <w:tc>
+          <w:tcPr>
+            <w:tcW w:type="dxa" w:w="1134"/>
+            <w:vAlign w:val="center"/>
+            <w:tcMar>
+              <w:top w:w="75" w:type="dxa"/>
+              <w:bottom w:w="75" w:type="dxa"/>
+              <w:left w:w="75" w:type="dxa"/>
+              <w:right w:w="75" w:type="dxa"/>
+            </w:tcMar>
+            <w:shd w:fill="F4F7FA"/>
+          </w:tcPr>
+          <w:p>
+            <w:pPr>
+              <w:spacing w:after="20" w:line="259" w:lineRule="auto"/>
+            </w:pPr>
+            <w:r>
+              <w:rPr>
+                <w:b w:val="0"/>
+                <w:sz w:val="18"/>
+              </w:rPr>
+              <w:t>0°</w:t>
+            </w:r>
+          </w:p>
+        </w:tc>
+      </w:tr>
+      <w:tr>
+        <w:trPr>
+          <w:cantSplit/>
+        </w:trPr>
+        <w:tc>
+          <w:tcPr>
+            <w:tcW w:type="dxa" w:w="1134"/>
+            <w:vAlign w:val="center"/>
+            <w:tcMar>
+              <w:top w:w="75" w:type="dxa"/>
+              <w:bottom w:w="75" w:type="dxa"/>
+              <w:left w:w="75" w:type="dxa"/>
+              <w:right w:w="75" w:type="dxa"/>
+            </w:tcMar>
+            <w:shd w:fill="FFFFFF"/>
+          </w:tcPr>
+          <w:p>
+            <w:pPr>
+              <w:spacing w:after="20" w:line="259" w:lineRule="auto"/>
+            </w:pPr>
+            <w:r>
+              <w:rPr>
+                <w:b w:val="0"/>
+                <w:sz w:val="18"/>
+              </w:rPr>
+              <w:t>右侧</w:t>
+            </w:r>
+          </w:p>
+        </w:tc>
+        <w:tc>
+          <w:tcPr>
+            <w:tcW w:type="dxa" w:w="3515"/>
+            <w:vAlign w:val="center"/>
+            <w:tcMar>
+              <w:top w:w="75" w:type="dxa"/>
+              <w:bottom w:w="75" w:type="dxa"/>
+              <w:left w:w="75" w:type="dxa"/>
+              <w:right w:w="75" w:type="dxa"/>
+            </w:tcMar>
+            <w:shd w:fill="FFFFFF"/>
+          </w:tcPr>
+          <w:p>
+            <w:pPr>
+              <w:spacing w:after="20" w:line="259" w:lineRule="auto"/>
+            </w:pPr>
+            <w:r>
+              <w:rPr>
+                <w:b w:val="0"/>
+                <w:sz w:val="18"/>
+              </w:rPr>
+              <w:t>−62.5°  可调 −65° 至 −60°</w:t>
+            </w:r>
+          </w:p>
+        </w:tc>
+        <w:tc>
+          <w:tcPr>
+            <w:tcW w:type="dxa" w:w="3969"/>
+            <w:vAlign w:val="center"/>
+            <w:tcMar>
+              <w:top w:w="75" w:type="dxa"/>
+              <w:bottom w:w="75" w:type="dxa"/>
+              <w:left w:w="75" w:type="dxa"/>
+              <w:right w:w="75" w:type="dxa"/>
+            </w:tcMar>
+            <w:shd w:fill="FFFFFF"/>
+          </w:tcPr>
+          <w:p>
+            <w:pPr>
+              <w:spacing w:after="20" w:line="259" w:lineRule="auto"/>
+            </w:pPr>
+            <w:r>
+              <w:rPr>
+                <w:b w:val="0"/>
+                <w:sz w:val="18"/>
+              </w:rPr>
+              <w:t>+27.5°  幅度可调 25° 至 30°</w:t>
+            </w:r>
+          </w:p>
+        </w:tc>
+        <w:tc>
+          <w:tcPr>
+            <w:tcW w:type="dxa" w:w="1134"/>
+            <w:vAlign w:val="center"/>
+            <w:tcMar>
+              <w:top w:w="75" w:type="dxa"/>
+              <w:bottom w:w="75" w:type="dxa"/>
+              <w:left w:w="75" w:type="dxa"/>
+              <w:right w:w="75" w:type="dxa"/>
+            </w:tcMar>
+            <w:shd w:fill="FFFFFF"/>
+          </w:tcPr>
+          <w:p>
+            <w:pPr>
+              <w:spacing w:after="20" w:line="259" w:lineRule="auto"/>
+            </w:pPr>
+            <w:r>
+              <w:rPr>
+                <w:b w:val="0"/>
+                <w:sz w:val="18"/>
+              </w:rPr>
+              <w:t>0°</w:t>
+            </w:r>
+          </w:p>
+        </w:tc>
+      </w:tr>
+    </w:tbl>
+    <w:p>
+      <w:pPr>
+        <w:spacing w:after="0"/>
+      </w:pPr>
     </w:p>
     <w:p>
       <w:pPr>
         <w:pStyle w:val="Heading2"/>
       </w:pPr>
       <w:r>
-        <w:t>拍照点均匀插值</w:t>
+        <w:t>射线与参考平面求交</w:t>
       </w:r>
     </w:p>
     <w:p>
       <w:r>
-        <w:t>对长度为 S 的每条拍摄航段，先计算间隔数 K，再产生 K+1 个位置。即使航段很短，也至少生成首尾两个拍照点。</w:t>
+        <w:t>设右向为 x，航段前向为 y，向上为 z；俯仰 p 相对水平面，偏航 q 顺时针。相机前向 f、右向 r、上向 u 定义如下。角度运算先转弧度。</w:t>
       </w:r>
     </w:p>
     <w:p>
@@ -3123,7 +3652,7 @@
       </w:pPr>
       <m:oMath>
         <m:r>
-          <m:t>K = max(1, ceil(S / shotSpacingM))</m:t>
+          <m:t>f = (sin q cos p, cos q cos p, sin p)</m:t>
         </m:r>
       </m:oMath>
     </w:p>
@@ -3133,7 +3662,7 @@
       </w:pPr>
       <m:oMath>
         <m:r>
-          <m:t>Pⱼ = P起 + (j/K)(P终 − P起)     j = 0 … K</m:t>
+          <m:t>r = (cos q, −sin q, 0)</m:t>
         </m:r>
       </m:oMath>
     </w:p>
@@ -3143,13 +3672,18 @@
       </w:pPr>
       <m:oMath>
         <m:r>
-          <m:t>实际点距 = S/K ≤ shotSpacingM</m:t>
+          <m:t>u = (−sin q sin p, −cos q sin p, cos p)</m:t>
         </m:r>
       </m:oMath>
     </w:p>
     <w:p>
       <w:r>
-        <w:t>插值在局部米制平面完成，再逆投影为经纬度。photos 按航段顺序展开，不去重；连接折线上不额外生成拍照点。实际点距除以速度得到参考拍摄间隔，若最小值小于相机预设间隔，只生成警告，不自动降速或切换停悬拍照。</w:t>
+        <w:t>令 tx=kNw/2、ty=kNh/2。四个角点分别取 a、b 为 ±1：射线方向 d=f+a tx r+b ty u。若 dz≥0，射线到达或越过地平线，拒绝有限足迹计算；其余角点取 t=−H/dz，得到水平足迹偏移 (t dx,t dy)。</w:t>
+      </w:r>
+    </w:p>
+    <w:p>
+      <w:r>
+        <w:t>captureModel.views 保存每向的 pitch、yawOffset、roll、四角偏移 corners 和 areaM2。各采集请求保存实际航段方向 flightHeadingDeg；全局观测方向为航段方向加相对偏航。返程会随航段转向，不固定朝地理东西方向。</w:t>
       </w:r>
     </w:p>
     <w:p>
@@ -3157,7 +3691,55 @@
         <w:pStyle w:val="Heading2"/>
       </w:pPr>
       <w:r>
-        <w:t>距离和时间</w:t>
+        <w:t>覆盖与照片预算</w:t>
+      </w:r>
+    </w:p>
+    <w:p>
+      <w:r>
+        <w:t>三向模式仍按第 5 章下视足迹确定行距与站距，并按下视足迹检查平面遗漏。侧向足迹不参与扩大行距，因此与相同参数的垂直模式保持同一条路线。每站预算 3 张，总预算为 stationCount×3；实际曝光位置、先后顺序和摆动时序仍由原生任务决定。</w:t>
+      </w:r>
+    </w:p>
+    <w:p>
+      <w:r>
+        <w:t>网页开启拍照点时展示首站三向足迹。足迹位于该站地形高程对应的水平面上，没有逐角点与坡面求交；它是近似示意，不能证明真实地形或建筑表面的重叠率。大疆作业指南提示正射摆拍可能降低最终正射质量。</w:t>
+      </w:r>
+    </w:p>
+    <w:p>
+      <w:r>
+        <w:br w:type="page"/>
+      </w:r>
+    </w:p>
+    <w:p>
+      <w:pPr>
+        <w:pStyle w:val="Heading1"/>
+      </w:pPr>
+      <w:r>
+        <w:t>11 在线地形采样与逐点赋高</w:t>
+      </w:r>
+    </w:p>
+    <w:p>
+      <w:pPr>
+        <w:pStyle w:val="Heading2"/>
+      </w:pPr>
+      <w:r>
+        <w:t>开放地形来源</w:t>
+      </w:r>
+    </w:p>
+    <w:p>
+      <w:r>
+        <w:t>采用 Mapzen Terrain Tiles 的 AWS Open Data Terrarium 瓦片，无需新增账号密钥。显示与数字采样使用同一数据源。固定采样层级为 13，地图地形最高也使用 13 级。水平索引为 Web Mercator；高度沿用多源正高基准，不转换为椭球高。</w:t>
+      </w:r>
+    </w:p>
+    <w:p>
+      <w:pPr>
+        <w:spacing w:line="252" w:lineRule="auto"/>
+      </w:pPr>
+      <w:r>
+        <w:rPr>
+          <w:rFonts w:ascii="Consolas" w:hAnsi="Consolas"/>
+          <w:sz w:val="18"/>
+        </w:rPr>
+        <w:t>https://s3.amazonaws.com/elevation-tiles-prod/terrarium/{z}/{x}/{y}.png</w:t>
       </w:r>
     </w:p>
     <w:p>
@@ -3166,7 +3748,135 @@
       </w:pPr>
       <m:oMath>
         <m:r>
-          <m:t>captureDistanceM = Σ 拍摄航段长度</m:t>
+          <m:t>地形高程 m = R × 256 + G + B/256 − 32768</m:t>
+        </m:r>
+      </m:oMath>
+    </w:p>
+    <w:p>
+      <w:r>
+        <w:t>每张瓦片 256×256 像素。解码前关闭图像色彩空间转换；透明像素、异常尺寸或异常高程直接拒绝。按像素中心位置进行跨瓦片双线性插值；渲染网格重采样到 257×257 个顶点，邻瓦片共享相同边界高度。13 级像素间隔不是原始 DEM 的精度保证。</w:t>
+      </w:r>
+    </w:p>
+    <w:p>
+      <w:pPr>
+        <w:pStyle w:val="Heading2"/>
+      </w:pPr>
+      <w:r>
+        <w:t>第一步 沿全部路线加密</w:t>
+      </w:r>
+    </w:p>
+    <w:p>
+      <w:r>
+        <w:t>在原始 AEQD 米制坐标中，对每个拍摄航段和连接折线分段加密，保持全部采集站和绕行拐点。每个子段的水平长度不大于 terrainSampleSpacing，默认 30 m，可设 5–100 m。不会以直接经纬度插值替代原有许可路径。</w:t>
+      </w:r>
+    </w:p>
+    <w:p>
+      <w:pPr>
+        <w:spacing w:after="140"/>
+      </w:pPr>
+      <m:oMath>
+        <m:r>
+          <m:t>加密间隔数 = max(1, ceil(子段水平长度 / 采样间距))</m:t>
+        </m:r>
+      </m:oMath>
+    </w:p>
+    <w:p>
+      <w:pPr>
+        <w:pStyle w:val="Heading2"/>
+      </w:pPr>
+      <w:r>
+        <w:t>第二步 去重采样并计算飞行高程</w:t>
+      </w:r>
+    </w:p>
+    <w:p>
+      <w:r>
+        <w:t>经纬度按 12 位小数建立缓存键，同一位置只请求一次。最多 50000 个唯一点，每批 256 点；数据源内部缓存最多 128 张瓦片，最多 6 路网络请求，单次请求 15 秒超时并重试一次。缺失高程或网络失败立即终止，不回退为 0 m。</w:t>
+      </w:r>
+    </w:p>
+    <w:p>
+      <w:pPr>
+        <w:spacing w:after="140"/>
+      </w:pPr>
+      <m:oMath>
+        <m:r>
+          <m:t>z飞行ᵢ = z地形ᵢ + altitude</m:t>
+        </m:r>
+      </m:oMath>
+    </w:p>
+    <w:p>
+      <w:r>
+        <w:t>赋高后，legs.positions、legs.start/end/photos、connections.positions、photos、path 和 captureRequests.position 均使用 [经度,纬度,飞行绝对高程]。terrain.status 从 pending 变为 ready，附带 source、verticalDatum、sampleLevel、sampleSpacingM 和 sampleCount。</w:t>
+      </w:r>
+    </w:p>
+    <w:p>
+      <w:pPr>
+        <w:pStyle w:val="Heading2"/>
+      </w:pPr>
+      <w:r>
+        <w:t>采样与真实连续航迹</w:t>
+      </w:r>
+    </w:p>
+    <w:p>
+      <w:r>
+        <w:t>固定 AGL 仅在采样点按数据源成立。点间是三维直线，可能跨过未采到的尖峰；DEM 缺少的建筑和树木不会自动出现。减小采样间距也不能恢复数据源中缺失的细节。</w:t>
+      </w:r>
+    </w:p>
+    <w:p>
+      <w:r>
+        <w:br w:type="page"/>
+      </w:r>
+    </w:p>
+    <w:p>
+      <w:pPr>
+        <w:pStyle w:val="Heading1"/>
+      </w:pPr>
+      <w:r>
+        <w:t>12 采集站与三维任务统计</w:t>
+      </w:r>
+    </w:p>
+    <w:p>
+      <w:pPr>
+        <w:pStyle w:val="Heading2"/>
+      </w:pPr>
+      <w:r>
+        <w:t>采集站插值</w:t>
+      </w:r>
+    </w:p>
+    <w:p>
+      <w:r>
+        <w:t>对每个水平拍摄航段长度 S，K=max(1,ceil(S/shotSpacingM))，按 Pj=P起+(j/K)(P终−P起) 生成 K+1 个站，j=0…K。两端都保留，即使很短的航段也至少两个站。各站不去重，区内连接不另设采集站。</w:t>
+      </w:r>
+    </w:p>
+    <w:p>
+      <w:pPr>
+        <w:spacing w:after="140"/>
+      </w:pPr>
+      <m:oMath>
+        <m:r>
+          <m:t>实际站距 = S/K ≤ shotSpacingM</m:t>
+        </m:r>
+      </m:oMath>
+    </w:p>
+    <w:p>
+      <w:r>
+        <w:t>stationCount=photos.length。垂直模式 photoCount=stationCount；三向模式 photoCount=3×stationCount，photoCountIsEstimate=true。photos 在三向模式表示采集站，不能把它理解为三张实际曝光的共同精确位置。</w:t>
+      </w:r>
+    </w:p>
+    <w:p>
+      <w:pPr>
+        <w:pStyle w:val="Heading2"/>
+      </w:pPr>
+      <w:r>
+        <w:t>距离与时间</w:t>
+      </w:r>
+    </w:p>
+    <w:p>
+      <w:pPr>
+        <w:spacing w:after="140"/>
+      </w:pPr>
+      <m:oMath>
+        <m:r>
+          <m:t>d三维 = √(Δx² + Δy² + Δz²)</m:t>
         </m:r>
       </m:oMath>
     </w:p>
@@ -3176,17 +3886,7 @@
       </w:pPr>
       <m:oMath>
         <m:r>
-          <m:t>transitDistanceM = Σ 连接折线各边长度</m:t>
-        </m:r>
-      </m:oMath>
-    </w:p>
-    <w:p>
-      <w:pPr>
-        <w:spacing w:after="140"/>
-      </w:pPr>
-      <m:oMath>
-        <m:r>
-          <m:t>distanceM = captureDistanceM + transitDistanceM</m:t>
+          <m:t>distanceM = Σ d拍摄三维 + Σ d连接三维</m:t>
         </m:r>
       </m:oMath>
     </w:p>
@@ -3206,13 +3906,13 @@
       </w:pPr>
       <m:oMath>
         <m:r>
-          <m:t>                   + max(0, legCount − 1) × turnSeconds</m:t>
+          <m:t>                   + max(0, legCount−1) × turnSeconds</m:t>
         </m:r>
       </m:oMath>
     </w:p>
     <w:p>
       <w:r>
-        <w:t>附加时间按“相邻拍摄航段之间”计一次，不按每个绕行转折点计时。基础行进时间对拍摄和连接统一使用 speed；未计入机场往返、起降、爬升、加减速、风和电池储备，不能直接推导可完成架次。</w:t>
+        <w:t>horizontalDistanceM 另存同一条路线的水平距离。speed 表示沿三维折线的统一速度。附加时间按相邻拍摄航段计一次，不按绕行顶点次数累计。未计原生三向摆动、稳定和曝光周期，也不含机场往返、起降与电池分架次。</w:t>
       </w:r>
     </w:p>
     <w:p>
@@ -3220,38 +3920,32 @@
         <w:pStyle w:val="Heading2"/>
       </w:pPr>
       <w:r>
-        <w:t>照片量和路径容量</w:t>
-      </w:r>
-    </w:p>
-    <w:p>
-      <w:r>
-        <w:t>补线后先汇总预计照片数量，超过 15000 张则报错；最终拍摄航段总数不能超过 4000。预检查在真正建立全部输出点之前执行，以控制浏览器计算和内存负担。</w:t>
+        <w:t>地形坡度与垂直速度提示</w:t>
       </w:r>
     </w:p>
     <w:p>
       <w:pPr>
-        <w:pStyle w:val="Heading2"/>
+        <w:spacing w:after="140"/>
       </w:pPr>
-      <w:r>
-        <w:t>总路径的组成</w:t>
-      </w:r>
+      <m:oMath>
+        <m:r>
+          <m:t>坡度 = Δz / √(Δx² + Δy²)</m:t>
+        </m:r>
+      </m:oMath>
+    </w:p>
+    <w:p>
+      <w:pPr>
+        <w:spacing w:after="140"/>
+      </w:pPr>
+      <m:oMath>
+        <m:r>
+          <m:t>所需垂速 = speed × Δz / d三维</m:t>
+        </m:r>
+      </m:oMath>
     </w:p>
     <w:p>
       <w:r>
-        <w:t>path 从第一条拍摄航段起点开始，依次添加拍摄终点、连接折线后续节点和下一航段终点。它是用于显示的路线折线，不是 photos 的别名，也不是含时间、云台、速度和动作的飞行控制指令。</w:t>
-      </w:r>
-    </w:p>
-    <w:p>
-      <w:r>
-        <w:br w:type="page"/>
-      </w:r>
-    </w:p>
-    <w:p>
-      <w:pPr>
-        <w:pStyle w:val="Heading1"/>
-      </w:pPr>
-      <w:r>
-        <w:t>11 输出数据结构与导出格式</w:t>
+        <w:t>分别统计最大上升和下降坡度、所需爬升及下降速度、累计升降高度。坡度超过 20% 时提示复核，此阈值只是提示条件，不是机型安全界限；当前没有按飞机性能自动减速。</w:t>
       </w:r>
     </w:p>
     <w:tbl>
@@ -3270,8 +3964,8 @@
         </w:tblBorders>
       </w:tblPr>
       <w:tblGrid>
-        <w:gridCol w:w="2324"/>
-        <w:gridCol w:w="7427"/>
+        <w:gridCol w:w="5726"/>
+        <w:gridCol w:w="4025"/>
       </w:tblGrid>
       <w:tr>
         <w:trPr>
@@ -3280,7 +3974,7 @@
         </w:trPr>
         <w:tc>
           <w:tcPr>
-            <w:tcW w:type="dxa" w:w="2324"/>
+            <w:tcW w:type="dxa" w:w="5726"/>
             <w:vAlign w:val="center"/>
             <w:tcMar>
               <w:top w:w="75" w:type="dxa"/>
@@ -3299,484 +3993,13 @@
                 <w:b/>
                 <w:sz w:val="18"/>
               </w:rPr>
-              <w:t>顶层字段</w:t>
+              <w:t>统计字段</w:t>
             </w:r>
           </w:p>
         </w:tc>
         <w:tc>
           <w:tcPr>
-            <w:tcW w:type="dxa" w:w="7427"/>
-            <w:vAlign w:val="center"/>
-            <w:tcMar>
-              <w:top w:w="75" w:type="dxa"/>
-              <w:bottom w:w="75" w:type="dxa"/>
-              <w:left w:w="75" w:type="dxa"/>
-              <w:right w:w="75" w:type="dxa"/>
-            </w:tcMar>
-            <w:shd w:fill="DBE5EE"/>
-          </w:tcPr>
-          <w:p>
-            <w:pPr>
-              <w:spacing w:after="20" w:line="259" w:lineRule="auto"/>
-            </w:pPr>
-            <w:r>
-              <w:rPr>
-                <w:b/>
-                <w:sz w:val="18"/>
-              </w:rPr>
-              <w:t>类型与含义</w:t>
-            </w:r>
-          </w:p>
-        </w:tc>
-      </w:tr>
-      <w:tr>
-        <w:trPr>
-          <w:cantSplit/>
-        </w:trPr>
-        <w:tc>
-          <w:tcPr>
-            <w:tcW w:type="dxa" w:w="2324"/>
-            <w:vAlign w:val="center"/>
-            <w:tcMar>
-              <w:top w:w="75" w:type="dxa"/>
-              <w:bottom w:w="75" w:type="dxa"/>
-              <w:left w:w="75" w:type="dxa"/>
-              <w:right w:w="75" w:type="dxa"/>
-            </w:tcMar>
-            <w:shd w:fill="FFFFFF"/>
-          </w:tcPr>
-          <w:p>
-            <w:pPr>
-              <w:spacing w:after="20" w:line="259" w:lineRule="auto"/>
-            </w:pPr>
-            <w:r>
-              <w:rPr>
-                <w:b w:val="0"/>
-                <w:sz w:val="18"/>
-              </w:rPr>
-              <w:t>heading</w:t>
-            </w:r>
-          </w:p>
-        </w:tc>
-        <w:tc>
-          <w:tcPr>
-            <w:tcW w:type="dxa" w:w="7427"/>
-            <w:vAlign w:val="center"/>
-            <w:tcMar>
-              <w:top w:w="75" w:type="dxa"/>
-              <w:bottom w:w="75" w:type="dxa"/>
-              <w:left w:w="75" w:type="dxa"/>
-              <w:right w:w="75" w:type="dxa"/>
-            </w:tcMar>
-            <w:shd w:fill="FFFFFF"/>
-          </w:tcPr>
-          <w:p>
-            <w:pPr>
-              <w:spacing w:after="20" w:line="259" w:lineRule="auto"/>
-            </w:pPr>
-            <w:r>
-              <w:rPr>
-                <w:b w:val="0"/>
-                <w:sz w:val="18"/>
-              </w:rPr>
-              <w:t>Number  主航向  [0,180) 度</w:t>
-            </w:r>
-          </w:p>
-        </w:tc>
-      </w:tr>
-      <w:tr>
-        <w:trPr>
-          <w:cantSplit/>
-        </w:trPr>
-        <w:tc>
-          <w:tcPr>
-            <w:tcW w:type="dxa" w:w="2324"/>
-            <w:vAlign w:val="center"/>
-            <w:tcMar>
-              <w:top w:w="75" w:type="dxa"/>
-              <w:bottom w:w="75" w:type="dxa"/>
-              <w:left w:w="75" w:type="dxa"/>
-              <w:right w:w="75" w:type="dxa"/>
-            </w:tcMar>
-            <w:shd w:fill="F4F7FA"/>
-          </w:tcPr>
-          <w:p>
-            <w:pPr>
-              <w:spacing w:after="20" w:line="259" w:lineRule="auto"/>
-            </w:pPr>
-            <w:r>
-              <w:rPr>
-                <w:b w:val="0"/>
-                <w:sz w:val="18"/>
-              </w:rPr>
-              <w:t>legs</w:t>
-            </w:r>
-          </w:p>
-        </w:tc>
-        <w:tc>
-          <w:tcPr>
-            <w:tcW w:type="dxa" w:w="7427"/>
-            <w:vAlign w:val="center"/>
-            <w:tcMar>
-              <w:top w:w="75" w:type="dxa"/>
-              <w:bottom w:w="75" w:type="dxa"/>
-              <w:left w:w="75" w:type="dxa"/>
-              <w:right w:w="75" w:type="dxa"/>
-            </w:tcMar>
-            <w:shd w:fill="F4F7FA"/>
-          </w:tcPr>
-          <w:p>
-            <w:pPr>
-              <w:spacing w:after="20" w:line="259" w:lineRule="auto"/>
-            </w:pPr>
-            <w:r>
-              <w:rPr>
-                <w:b w:val="0"/>
-                <w:sz w:val="18"/>
-              </w:rPr>
-              <w:t>Array  每项 {id, pass, start, end, photos}</w:t>
-            </w:r>
-          </w:p>
-        </w:tc>
-      </w:tr>
-      <w:tr>
-        <w:trPr>
-          <w:cantSplit/>
-        </w:trPr>
-        <w:tc>
-          <w:tcPr>
-            <w:tcW w:type="dxa" w:w="2324"/>
-            <w:vAlign w:val="center"/>
-            <w:tcMar>
-              <w:top w:w="75" w:type="dxa"/>
-              <w:bottom w:w="75" w:type="dxa"/>
-              <w:left w:w="75" w:type="dxa"/>
-              <w:right w:w="75" w:type="dxa"/>
-            </w:tcMar>
-            <w:shd w:fill="FFFFFF"/>
-          </w:tcPr>
-          <w:p>
-            <w:pPr>
-              <w:spacing w:after="20" w:line="259" w:lineRule="auto"/>
-            </w:pPr>
-            <w:r>
-              <w:rPr>
-                <w:b w:val="0"/>
-                <w:sz w:val="18"/>
-              </w:rPr>
-              <w:t>connections</w:t>
-            </w:r>
-          </w:p>
-        </w:tc>
-        <w:tc>
-          <w:tcPr>
-            <w:tcW w:type="dxa" w:w="7427"/>
-            <w:vAlign w:val="center"/>
-            <w:tcMar>
-              <w:top w:w="75" w:type="dxa"/>
-              <w:bottom w:w="75" w:type="dxa"/>
-              <w:left w:w="75" w:type="dxa"/>
-              <w:right w:w="75" w:type="dxa"/>
-            </w:tcMar>
-            <w:shd w:fill="FFFFFF"/>
-          </w:tcPr>
-          <w:p>
-            <w:pPr>
-              <w:spacing w:after="20" w:line="259" w:lineRule="auto"/>
-            </w:pPr>
-            <w:r>
-              <w:rPr>
-                <w:b w:val="0"/>
-                <w:sz w:val="18"/>
-              </w:rPr>
-              <w:t>Array  每项 {positions}  相邻拍摄段的连接折线</w:t>
-            </w:r>
-          </w:p>
-        </w:tc>
-      </w:tr>
-      <w:tr>
-        <w:trPr>
-          <w:cantSplit/>
-        </w:trPr>
-        <w:tc>
-          <w:tcPr>
-            <w:tcW w:type="dxa" w:w="2324"/>
-            <w:vAlign w:val="center"/>
-            <w:tcMar>
-              <w:top w:w="75" w:type="dxa"/>
-              <w:bottom w:w="75" w:type="dxa"/>
-              <w:left w:w="75" w:type="dxa"/>
-              <w:right w:w="75" w:type="dxa"/>
-            </w:tcMar>
-            <w:shd w:fill="F4F7FA"/>
-          </w:tcPr>
-          <w:p>
-            <w:pPr>
-              <w:spacing w:after="20" w:line="259" w:lineRule="auto"/>
-            </w:pPr>
-            <w:r>
-              <w:rPr>
-                <w:b w:val="0"/>
-                <w:sz w:val="18"/>
-              </w:rPr>
-              <w:t>photos</w:t>
-            </w:r>
-          </w:p>
-        </w:tc>
-        <w:tc>
-          <w:tcPr>
-            <w:tcW w:type="dxa" w:w="7427"/>
-            <w:vAlign w:val="center"/>
-            <w:tcMar>
-              <w:top w:w="75" w:type="dxa"/>
-              <w:bottom w:w="75" w:type="dxa"/>
-              <w:left w:w="75" w:type="dxa"/>
-              <w:right w:w="75" w:type="dxa"/>
-            </w:tcMar>
-            <w:shd w:fill="F4F7FA"/>
-          </w:tcPr>
-          <w:p>
-            <w:pPr>
-              <w:spacing w:after="20" w:line="259" w:lineRule="auto"/>
-            </w:pPr>
-            <w:r>
-              <w:rPr>
-                <w:b w:val="0"/>
-                <w:sz w:val="18"/>
-              </w:rPr>
-              <w:t>Array&lt;[lon,lat]&gt;  按任务顺序展开的拍照位置</w:t>
-            </w:r>
-          </w:p>
-        </w:tc>
-      </w:tr>
-      <w:tr>
-        <w:trPr>
-          <w:cantSplit/>
-        </w:trPr>
-        <w:tc>
-          <w:tcPr>
-            <w:tcW w:type="dxa" w:w="2324"/>
-            <w:vAlign w:val="center"/>
-            <w:tcMar>
-              <w:top w:w="75" w:type="dxa"/>
-              <w:bottom w:w="75" w:type="dxa"/>
-              <w:left w:w="75" w:type="dxa"/>
-              <w:right w:w="75" w:type="dxa"/>
-            </w:tcMar>
-            <w:shd w:fill="FFFFFF"/>
-          </w:tcPr>
-          <w:p>
-            <w:pPr>
-              <w:spacing w:after="20" w:line="259" w:lineRule="auto"/>
-            </w:pPr>
-            <w:r>
-              <w:rPr>
-                <w:b w:val="0"/>
-                <w:sz w:val="18"/>
-              </w:rPr>
-              <w:t>path</w:t>
-            </w:r>
-          </w:p>
-        </w:tc>
-        <w:tc>
-          <w:tcPr>
-            <w:tcW w:type="dxa" w:w="7427"/>
-            <w:vAlign w:val="center"/>
-            <w:tcMar>
-              <w:top w:w="75" w:type="dxa"/>
-              <w:bottom w:w="75" w:type="dxa"/>
-              <w:left w:w="75" w:type="dxa"/>
-              <w:right w:w="75" w:type="dxa"/>
-            </w:tcMar>
-            <w:shd w:fill="FFFFFF"/>
-          </w:tcPr>
-          <w:p>
-            <w:pPr>
-              <w:spacing w:after="20" w:line="259" w:lineRule="auto"/>
-            </w:pPr>
-            <w:r>
-              <w:rPr>
-                <w:b w:val="0"/>
-                <w:sz w:val="18"/>
-              </w:rPr>
-              <w:t>Array&lt;[lon,lat]&gt;  拍摄与转场合并的展示路径</w:t>
-            </w:r>
-          </w:p>
-        </w:tc>
-      </w:tr>
-      <w:tr>
-        <w:trPr>
-          <w:cantSplit/>
-        </w:trPr>
-        <w:tc>
-          <w:tcPr>
-            <w:tcW w:type="dxa" w:w="2324"/>
-            <w:vAlign w:val="center"/>
-            <w:tcMar>
-              <w:top w:w="75" w:type="dxa"/>
-              <w:bottom w:w="75" w:type="dxa"/>
-              <w:left w:w="75" w:type="dxa"/>
-              <w:right w:w="75" w:type="dxa"/>
-            </w:tcMar>
-            <w:shd w:fill="F4F7FA"/>
-          </w:tcPr>
-          <w:p>
-            <w:pPr>
-              <w:spacing w:after="20" w:line="259" w:lineRule="auto"/>
-            </w:pPr>
-            <w:r>
-              <w:rPr>
-                <w:b w:val="0"/>
-                <w:sz w:val="18"/>
-              </w:rPr>
-              <w:t>stats</w:t>
-            </w:r>
-          </w:p>
-        </w:tc>
-        <w:tc>
-          <w:tcPr>
-            <w:tcW w:type="dxa" w:w="7427"/>
-            <w:vAlign w:val="center"/>
-            <w:tcMar>
-              <w:top w:w="75" w:type="dxa"/>
-              <w:bottom w:w="75" w:type="dxa"/>
-              <w:left w:w="75" w:type="dxa"/>
-              <w:right w:w="75" w:type="dxa"/>
-            </w:tcMar>
-            <w:shd w:fill="F4F7FA"/>
-          </w:tcPr>
-          <w:p>
-            <w:pPr>
-              <w:spacing w:after="20" w:line="259" w:lineRule="auto"/>
-            </w:pPr>
-            <w:r>
-              <w:rPr>
-                <w:b w:val="0"/>
-                <w:sz w:val="18"/>
-              </w:rPr>
-              <w:t>Object  统计值  见下表</w:t>
-            </w:r>
-          </w:p>
-        </w:tc>
-      </w:tr>
-      <w:tr>
-        <w:trPr>
-          <w:cantSplit/>
-        </w:trPr>
-        <w:tc>
-          <w:tcPr>
-            <w:tcW w:type="dxa" w:w="2324"/>
-            <w:vAlign w:val="center"/>
-            <w:tcMar>
-              <w:top w:w="75" w:type="dxa"/>
-              <w:bottom w:w="75" w:type="dxa"/>
-              <w:left w:w="75" w:type="dxa"/>
-              <w:right w:w="75" w:type="dxa"/>
-            </w:tcMar>
-            <w:shd w:fill="FFFFFF"/>
-          </w:tcPr>
-          <w:p>
-            <w:pPr>
-              <w:spacing w:after="20" w:line="259" w:lineRule="auto"/>
-            </w:pPr>
-            <w:r>
-              <w:rPr>
-                <w:b w:val="0"/>
-                <w:sz w:val="18"/>
-              </w:rPr>
-              <w:t>warnings</w:t>
-            </w:r>
-          </w:p>
-        </w:tc>
-        <w:tc>
-          <w:tcPr>
-            <w:tcW w:type="dxa" w:w="7427"/>
-            <w:vAlign w:val="center"/>
-            <w:tcMar>
-              <w:top w:w="75" w:type="dxa"/>
-              <w:bottom w:w="75" w:type="dxa"/>
-              <w:left w:w="75" w:type="dxa"/>
-              <w:right w:w="75" w:type="dxa"/>
-            </w:tcMar>
-            <w:shd w:fill="FFFFFF"/>
-          </w:tcPr>
-          <w:p>
-            <w:pPr>
-              <w:spacing w:after="20" w:line="259" w:lineRule="auto"/>
-            </w:pPr>
-            <w:r>
-              <w:rPr>
-                <w:b w:val="0"/>
-                <w:sz w:val="18"/>
-              </w:rPr>
-              <w:t>String[]  近似条件和执行限制提示</w:t>
-            </w:r>
-          </w:p>
-        </w:tc>
-      </w:tr>
-    </w:tbl>
-    <w:p>
-      <w:pPr>
-        <w:spacing w:after="0"/>
-      </w:pPr>
-    </w:p>
-    <w:p>
-      <w:r>
-        <w:t>legs.id 从 1 连续编号；pass 为 1 或 2；start、end 与 photos 中的点均为二维经纬度。connections 数量通常为 legCount−1，positions 至少包含两端点。高度保存在输入 options 中，不附加到这些坐标数组。</w:t>
-      </w:r>
-    </w:p>
-    <w:tbl>
-      <w:tblPr>
-        <w:tblW w:type="auto" w:w="0"/>
-        <w:jc w:val="center"/>
-        <w:tblLayout w:type="fixed"/>
-        <w:tblLook w:firstColumn="1" w:firstRow="1" w:lastColumn="0" w:lastRow="0" w:noHBand="0" w:noVBand="1" w:val="04A0"/>
-        <w:tblBorders>
-          <w:top w:val="single" w:sz="4" w:color="D9D9D9"/>
-          <w:left w:val="single" w:sz="4" w:color="D9D9D9"/>
-          <w:bottom w:val="single" w:sz="4" w:color="D9D9D9"/>
-          <w:right w:val="single" w:sz="4" w:color="D9D9D9"/>
-          <w:insideH w:val="single" w:sz="4" w:color="D9D9D9"/>
-          <w:insideV w:val="single" w:sz="4" w:color="D9D9D9"/>
-        </w:tblBorders>
-      </w:tblPr>
-      <w:tblGrid>
-        <w:gridCol w:w="4762"/>
-        <w:gridCol w:w="4989"/>
-      </w:tblGrid>
-      <w:tr>
-        <w:trPr>
-          <w:cantSplit/>
-          <w:tblHeader/>
-        </w:trPr>
-        <w:tc>
-          <w:tcPr>
-            <w:tcW w:type="dxa" w:w="4762"/>
-            <w:vAlign w:val="center"/>
-            <w:tcMar>
-              <w:top w:w="75" w:type="dxa"/>
-              <w:bottom w:w="75" w:type="dxa"/>
-              <w:left w:w="75" w:type="dxa"/>
-              <w:right w:w="75" w:type="dxa"/>
-            </w:tcMar>
-            <w:shd w:fill="DBE5EE"/>
-          </w:tcPr>
-          <w:p>
-            <w:pPr>
-              <w:spacing w:after="20" w:line="259" w:lineRule="auto"/>
-            </w:pPr>
-            <w:r>
-              <w:rPr>
-                <w:b/>
-                <w:sz w:val="18"/>
-              </w:rPr>
-              <w:t>stats 字段</w:t>
-            </w:r>
-          </w:p>
-        </w:tc>
-        <w:tc>
-          <w:tcPr>
-            <w:tcW w:type="dxa" w:w="4989"/>
+            <w:tcW w:type="dxa" w:w="4025"/>
             <w:vAlign w:val="center"/>
             <w:tcMar>
               <w:top w:w="75" w:type="dxa"/>
@@ -3806,7 +4029,7 @@
         </w:trPr>
         <w:tc>
           <w:tcPr>
-            <w:tcW w:type="dxa" w:w="4762"/>
+            <w:tcW w:type="dxa" w:w="5726"/>
             <w:vAlign w:val="center"/>
             <w:tcMar>
               <w:top w:w="75" w:type="dxa"/>
@@ -3825,13 +4048,13 @@
                 <w:b w:val="0"/>
                 <w:sz w:val="18"/>
               </w:rPr>
-              <w:t>areaM2</w:t>
+              <w:t>terrainMinM / terrainMaxM</w:t>
             </w:r>
           </w:p>
         </w:tc>
         <w:tc>
           <w:tcPr>
-            <w:tcW w:type="dxa" w:w="4989"/>
+            <w:tcW w:type="dxa" w:w="4025"/>
             <w:vAlign w:val="center"/>
             <w:tcMar>
               <w:top w:w="75" w:type="dxa"/>
@@ -3850,7 +4073,7 @@
                 <w:b w:val="0"/>
                 <w:sz w:val="18"/>
               </w:rPr>
-              <w:t>m²  外环减孔洞的净面积</w:t>
+              <w:t>m  全部路线采样点的地形高程范围</w:t>
             </w:r>
           </w:p>
         </w:tc>
@@ -3861,7 +4084,7 @@
         </w:trPr>
         <w:tc>
           <w:tcPr>
-            <w:tcW w:type="dxa" w:w="4762"/>
+            <w:tcW w:type="dxa" w:w="5726"/>
             <w:vAlign w:val="center"/>
             <w:tcMar>
               <w:top w:w="75" w:type="dxa"/>
@@ -3880,13 +4103,13 @@
                 <w:b w:val="0"/>
                 <w:sz w:val="18"/>
               </w:rPr>
-              <w:t>distanceM / captureDistanceM / transitDistanceM</w:t>
+              <w:t>absoluteHeightMinM / absoluteHeightMaxM</w:t>
             </w:r>
           </w:p>
         </w:tc>
         <w:tc>
           <w:tcPr>
-            <w:tcW w:type="dxa" w:w="4989"/>
+            <w:tcW w:type="dxa" w:w="4025"/>
             <w:vAlign w:val="center"/>
             <w:tcMar>
               <w:top w:w="75" w:type="dxa"/>
@@ -3905,7 +4128,7 @@
                 <w:b w:val="0"/>
                 <w:sz w:val="18"/>
               </w:rPr>
-              <w:t>m  区内总距离 / 拍摄距离 / 连接距离</w:t>
+              <w:t>m  地形高程范围加 AGL</w:t>
             </w:r>
           </w:p>
         </w:tc>
@@ -3916,7 +4139,7 @@
         </w:trPr>
         <w:tc>
           <w:tcPr>
-            <w:tcW w:type="dxa" w:w="4762"/>
+            <w:tcW w:type="dxa" w:w="5726"/>
             <w:vAlign w:val="center"/>
             <w:tcMar>
               <w:top w:w="75" w:type="dxa"/>
@@ -3935,13 +4158,13 @@
                 <w:b w:val="0"/>
                 <w:sz w:val="18"/>
               </w:rPr>
-              <w:t>photoCount / legCount</w:t>
+              <w:t>aglM / gsdCm</w:t>
             </w:r>
           </w:p>
         </w:tc>
         <w:tc>
           <w:tcPr>
-            <w:tcW w:type="dxa" w:w="4989"/>
+            <w:tcW w:type="dxa" w:w="4025"/>
             <w:vAlign w:val="center"/>
             <w:tcMar>
               <w:top w:w="75" w:type="dxa"/>
@@ -3960,7 +4183,7 @@
                 <w:b w:val="0"/>
                 <w:sz w:val="18"/>
               </w:rPr>
-              <w:t>张 / 段  照片数与拍摄航段数</w:t>
+              <w:t>m / cm/px  离地高度与下视名义 GSD</w:t>
             </w:r>
           </w:p>
         </w:tc>
@@ -3971,7 +4194,7 @@
         </w:trPr>
         <w:tc>
           <w:tcPr>
-            <w:tcW w:type="dxa" w:w="4762"/>
+            <w:tcW w:type="dxa" w:w="5726"/>
             <w:vAlign w:val="center"/>
             <w:tcMar>
               <w:top w:w="75" w:type="dxa"/>
@@ -3990,13 +4213,13 @@
                 <w:b w:val="0"/>
                 <w:sz w:val="18"/>
               </w:rPr>
-              <w:t>coverageAddedRows</w:t>
+              <w:t>footprintWidthM / footprintLengthM</w:t>
             </w:r>
           </w:p>
         </w:tc>
         <w:tc>
           <w:tcPr>
-            <w:tcW w:type="dxa" w:w="4989"/>
+            <w:tcW w:type="dxa" w:w="4025"/>
             <w:vAlign w:val="center"/>
             <w:tcMar>
               <w:top w:w="75" w:type="dxa"/>
@@ -4015,7 +4238,7 @@
                 <w:b w:val="0"/>
                 <w:sz w:val="18"/>
               </w:rPr>
-              <w:t>行  各遍新增扫描行合计</w:t>
+              <w:t>m  下视参考足迹宽长</w:t>
             </w:r>
           </w:p>
         </w:tc>
@@ -4026,7 +4249,7 @@
         </w:trPr>
         <w:tc>
           <w:tcPr>
-            <w:tcW w:type="dxa" w:w="4762"/>
+            <w:tcW w:type="dxa" w:w="5726"/>
             <w:vAlign w:val="center"/>
             <w:tcMar>
               <w:top w:w="75" w:type="dxa"/>
@@ -4045,13 +4268,13 @@
                 <w:b w:val="0"/>
                 <w:sz w:val="18"/>
               </w:rPr>
-              <w:t>durationSeconds</w:t>
+              <w:t>maxRequiredClimbRateMps / maxRequiredDescentRateMps</w:t>
             </w:r>
           </w:p>
         </w:tc>
         <w:tc>
           <w:tcPr>
-            <w:tcW w:type="dxa" w:w="4989"/>
+            <w:tcW w:type="dxa" w:w="4025"/>
             <w:vAlign w:val="center"/>
             <w:tcMar>
               <w:top w:w="75" w:type="dxa"/>
@@ -4070,7 +4293,101 @@
                 <w:b w:val="0"/>
                 <w:sz w:val="18"/>
               </w:rPr>
-              <w:t>s  统一速度与段间预留时间估算</w:t>
+              <w:t>m/s  按三维航速推算的最大垂速</w:t>
+            </w:r>
+          </w:p>
+        </w:tc>
+      </w:tr>
+    </w:tbl>
+    <w:p>
+      <w:pPr>
+        <w:spacing w:after="0"/>
+      </w:pPr>
+    </w:p>
+    <w:p>
+      <w:r>
+        <w:br w:type="page"/>
+      </w:r>
+    </w:p>
+    <w:p>
+      <w:pPr>
+        <w:pStyle w:val="Heading1"/>
+      </w:pPr>
+      <w:r>
+        <w:t>13 输出数据与导出格式</w:t>
+      </w:r>
+    </w:p>
+    <w:tbl>
+      <w:tblPr>
+        <w:tblW w:type="auto" w:w="0"/>
+        <w:jc w:val="center"/>
+        <w:tblLayout w:type="fixed"/>
+        <w:tblLook w:firstColumn="1" w:firstRow="1" w:lastColumn="0" w:lastRow="0" w:noHBand="0" w:noVBand="1" w:val="04A0"/>
+        <w:tblBorders>
+          <w:top w:val="single" w:sz="4" w:color="D9D9D9"/>
+          <w:left w:val="single" w:sz="4" w:color="D9D9D9"/>
+          <w:bottom w:val="single" w:sz="4" w:color="D9D9D9"/>
+          <w:right w:val="single" w:sz="4" w:color="D9D9D9"/>
+          <w:insideH w:val="single" w:sz="4" w:color="D9D9D9"/>
+          <w:insideV w:val="single" w:sz="4" w:color="D9D9D9"/>
+        </w:tblBorders>
+      </w:tblPr>
+      <w:tblGrid>
+        <w:gridCol w:w="2778"/>
+        <w:gridCol w:w="6973"/>
+      </w:tblGrid>
+      <w:tr>
+        <w:trPr>
+          <w:cantSplit/>
+          <w:tblHeader/>
+        </w:trPr>
+        <w:tc>
+          <w:tcPr>
+            <w:tcW w:type="dxa" w:w="2778"/>
+            <w:vAlign w:val="center"/>
+            <w:tcMar>
+              <w:top w:w="75" w:type="dxa"/>
+              <w:bottom w:w="75" w:type="dxa"/>
+              <w:left w:w="75" w:type="dxa"/>
+              <w:right w:w="75" w:type="dxa"/>
+            </w:tcMar>
+            <w:shd w:fill="DBE5EE"/>
+          </w:tcPr>
+          <w:p>
+            <w:pPr>
+              <w:spacing w:after="20" w:line="259" w:lineRule="auto"/>
+            </w:pPr>
+            <w:r>
+              <w:rPr>
+                <w:b/>
+                <w:sz w:val="18"/>
+              </w:rPr>
+              <w:t>顶层字段</w:t>
+            </w:r>
+          </w:p>
+        </w:tc>
+        <w:tc>
+          <w:tcPr>
+            <w:tcW w:type="dxa" w:w="6973"/>
+            <w:vAlign w:val="center"/>
+            <w:tcMar>
+              <w:top w:w="75" w:type="dxa"/>
+              <w:bottom w:w="75" w:type="dxa"/>
+              <w:left w:w="75" w:type="dxa"/>
+              <w:right w:w="75" w:type="dxa"/>
+            </w:tcMar>
+            <w:shd w:fill="DBE5EE"/>
+          </w:tcPr>
+          <w:p>
+            <w:pPr>
+              <w:spacing w:after="20" w:line="259" w:lineRule="auto"/>
+            </w:pPr>
+            <w:r>
+              <w:rPr>
+                <w:b/>
+                <w:sz w:val="18"/>
+              </w:rPr>
+              <w:t>含义</w:t>
             </w:r>
           </w:p>
         </w:tc>
@@ -4081,7 +4398,62 @@
         </w:trPr>
         <w:tc>
           <w:tcPr>
-            <w:tcW w:type="dxa" w:w="4762"/>
+            <w:tcW w:type="dxa" w:w="2778"/>
+            <w:vAlign w:val="center"/>
+            <w:tcMar>
+              <w:top w:w="75" w:type="dxa"/>
+              <w:bottom w:w="75" w:type="dxa"/>
+              <w:left w:w="75" w:type="dxa"/>
+              <w:right w:w="75" w:type="dxa"/>
+            </w:tcMar>
+            <w:shd w:fill="FFFFFF"/>
+          </w:tcPr>
+          <w:p>
+            <w:pPr>
+              <w:spacing w:after="20" w:line="259" w:lineRule="auto"/>
+            </w:pPr>
+            <w:r>
+              <w:rPr>
+                <w:b w:val="0"/>
+                <w:sz w:val="18"/>
+              </w:rPr>
+              <w:t>heading / heightMode / captureMode</w:t>
+            </w:r>
+          </w:p>
+        </w:tc>
+        <w:tc>
+          <w:tcPr>
+            <w:tcW w:type="dxa" w:w="6973"/>
+            <w:vAlign w:val="center"/>
+            <w:tcMar>
+              <w:top w:w="75" w:type="dxa"/>
+              <w:bottom w:w="75" w:type="dxa"/>
+              <w:left w:w="75" w:type="dxa"/>
+              <w:right w:w="75" w:type="dxa"/>
+            </w:tcMar>
+            <w:shd w:fill="FFFFFF"/>
+          </w:tcPr>
+          <w:p>
+            <w:pPr>
+              <w:spacing w:after="20" w:line="259" w:lineRule="auto"/>
+            </w:pPr>
+            <w:r>
+              <w:rPr>
+                <w:b w:val="0"/>
+                <w:sz w:val="18"/>
+              </w:rPr>
+              <w:t>主航向 / terrainAGL / nadir 或 smartOrtho</w:t>
+            </w:r>
+          </w:p>
+        </w:tc>
+      </w:tr>
+      <w:tr>
+        <w:trPr>
+          <w:cantSplit/>
+        </w:trPr>
+        <w:tc>
+          <w:tcPr>
+            <w:tcW w:type="dxa" w:w="2778"/>
             <w:vAlign w:val="center"/>
             <w:tcMar>
               <w:top w:w="75" w:type="dxa"/>
@@ -4100,13 +4472,13 @@
                 <w:b w:val="0"/>
                 <w:sz w:val="18"/>
               </w:rPr>
-              <w:t>gsdCm / roofGsdCm</w:t>
+              <w:t>projectionOrigin</w:t>
             </w:r>
           </w:p>
         </w:tc>
         <w:tc>
           <w:tcPr>
-            <w:tcW w:type="dxa" w:w="4989"/>
+            <w:tcW w:type="dxa" w:w="6973"/>
             <w:vAlign w:val="center"/>
             <w:tcMar>
               <w:top w:w="75" w:type="dxa"/>
@@ -4125,7 +4497,7 @@
                 <w:b w:val="0"/>
                 <w:sz w:val="18"/>
               </w:rPr>
-              <w:t>cm/px  参考地面 / 最高屋顶 GSD</w:t>
+              <w:t>原 AEQD 中心  用于保持加密几何一致</w:t>
             </w:r>
           </w:p>
         </w:tc>
@@ -4136,7 +4508,7 @@
         </w:trPr>
         <w:tc>
           <w:tcPr>
-            <w:tcW w:type="dxa" w:w="4762"/>
+            <w:tcW w:type="dxa" w:w="2778"/>
             <w:vAlign w:val="center"/>
             <w:tcMar>
               <w:top w:w="75" w:type="dxa"/>
@@ -4155,13 +4527,13 @@
                 <w:b w:val="0"/>
                 <w:sz w:val="18"/>
               </w:rPr>
-              <w:t>lineSpacingM / shotSpacingM</w:t>
+              <w:t>legs</w:t>
             </w:r>
           </w:p>
         </w:tc>
         <w:tc>
           <w:tcPr>
-            <w:tcW w:type="dxa" w:w="4989"/>
+            <w:tcW w:type="dxa" w:w="6973"/>
             <w:vAlign w:val="center"/>
             <w:tcMar>
               <w:top w:w="75" w:type="dxa"/>
@@ -4180,7 +4552,7 @@
                 <w:b w:val="0"/>
                 <w:sz w:val="18"/>
               </w:rPr>
-              <w:t>m  目标最大行距 / 目标最大点距</w:t>
+              <w:t>拍摄段  id pass start end photos positions flightHeadingDeg</w:t>
             </w:r>
           </w:p>
         </w:tc>
@@ -4191,7 +4563,7 @@
         </w:trPr>
         <w:tc>
           <w:tcPr>
-            <w:tcW w:type="dxa" w:w="4762"/>
+            <w:tcW w:type="dxa" w:w="2778"/>
             <w:vAlign w:val="center"/>
             <w:tcMar>
               <w:top w:w="75" w:type="dxa"/>
@@ -4210,13 +4582,13 @@
                 <w:b w:val="0"/>
                 <w:sz w:val="18"/>
               </w:rPr>
-              <w:t>minClearanceM / relativeDockHeightM</w:t>
+              <w:t>connections / path</w:t>
             </w:r>
           </w:p>
         </w:tc>
         <w:tc>
           <w:tcPr>
-            <w:tcW w:type="dxa" w:w="4989"/>
+            <w:tcW w:type="dxa" w:w="6973"/>
             <w:vAlign w:val="center"/>
             <w:tcMar>
               <w:top w:w="75" w:type="dxa"/>
@@ -4235,7 +4607,282 @@
                 <w:b w:val="0"/>
                 <w:sz w:val="18"/>
               </w:rPr>
-              <w:t>m  H−B / H−机场高度</w:t>
+              <w:t>加密并带高程的区内连接 / 完整路线</w:t>
+            </w:r>
+          </w:p>
+        </w:tc>
+      </w:tr>
+      <w:tr>
+        <w:trPr>
+          <w:cantSplit/>
+        </w:trPr>
+        <w:tc>
+          <w:tcPr>
+            <w:tcW w:type="dxa" w:w="2778"/>
+            <w:vAlign w:val="center"/>
+            <w:tcMar>
+              <w:top w:w="75" w:type="dxa"/>
+              <w:bottom w:w="75" w:type="dxa"/>
+              <w:left w:w="75" w:type="dxa"/>
+              <w:right w:w="75" w:type="dxa"/>
+            </w:tcMar>
+            <w:shd w:fill="FFFFFF"/>
+          </w:tcPr>
+          <w:p>
+            <w:pPr>
+              <w:spacing w:after="20" w:line="259" w:lineRule="auto"/>
+            </w:pPr>
+            <w:r>
+              <w:rPr>
+                <w:b w:val="0"/>
+                <w:sz w:val="18"/>
+              </w:rPr>
+              <w:t>photos</w:t>
+            </w:r>
+          </w:p>
+        </w:tc>
+        <w:tc>
+          <w:tcPr>
+            <w:tcW w:type="dxa" w:w="6973"/>
+            <w:vAlign w:val="center"/>
+            <w:tcMar>
+              <w:top w:w="75" w:type="dxa"/>
+              <w:bottom w:w="75" w:type="dxa"/>
+              <w:left w:w="75" w:type="dxa"/>
+              <w:right w:w="75" w:type="dxa"/>
+            </w:tcMar>
+            <w:shd w:fill="FFFFFF"/>
+          </w:tcPr>
+          <w:p>
+            <w:pPr>
+              <w:spacing w:after="20" w:line="259" w:lineRule="auto"/>
+            </w:pPr>
+            <w:r>
+              <w:rPr>
+                <w:b w:val="0"/>
+                <w:sz w:val="18"/>
+              </w:rPr>
+              <w:t>带高程的有序采集站  三向模式不等于实际曝光清单</w:t>
+            </w:r>
+          </w:p>
+        </w:tc>
+      </w:tr>
+      <w:tr>
+        <w:trPr>
+          <w:cantSplit/>
+        </w:trPr>
+        <w:tc>
+          <w:tcPr>
+            <w:tcW w:type="dxa" w:w="2778"/>
+            <w:vAlign w:val="center"/>
+            <w:tcMar>
+              <w:top w:w="75" w:type="dxa"/>
+              <w:bottom w:w="75" w:type="dxa"/>
+              <w:left w:w="75" w:type="dxa"/>
+              <w:right w:w="75" w:type="dxa"/>
+            </w:tcMar>
+            <w:shd w:fill="F4F7FA"/>
+          </w:tcPr>
+          <w:p>
+            <w:pPr>
+              <w:spacing w:after="20" w:line="259" w:lineRule="auto"/>
+            </w:pPr>
+            <w:r>
+              <w:rPr>
+                <w:b w:val="0"/>
+                <w:sz w:val="18"/>
+              </w:rPr>
+              <w:t>captureModel</w:t>
+            </w:r>
+          </w:p>
+        </w:tc>
+        <w:tc>
+          <w:tcPr>
+            <w:tcW w:type="dxa" w:w="6973"/>
+            <w:vAlign w:val="center"/>
+            <w:tcMar>
+              <w:top w:w="75" w:type="dxa"/>
+              <w:bottom w:w="75" w:type="dxa"/>
+              <w:left w:w="75" w:type="dxa"/>
+              <w:right w:w="75" w:type="dxa"/>
+            </w:tcMar>
+            <w:shd w:fill="F4F7FA"/>
+          </w:tcPr>
+          <w:p>
+            <w:pPr>
+              <w:spacing w:after="20" w:line="259" w:lineRule="auto"/>
+            </w:pPr>
+            <w:r>
+              <w:rPr>
+                <w:b w:val="0"/>
+                <w:sz w:val="18"/>
+              </w:rPr>
+              <w:t>近似姿态源  参考平面  三向相机足迹模板</w:t>
+            </w:r>
+          </w:p>
+        </w:tc>
+      </w:tr>
+      <w:tr>
+        <w:trPr>
+          <w:cantSplit/>
+        </w:trPr>
+        <w:tc>
+          <w:tcPr>
+            <w:tcW w:type="dxa" w:w="2778"/>
+            <w:vAlign w:val="center"/>
+            <w:tcMar>
+              <w:top w:w="75" w:type="dxa"/>
+              <w:bottom w:w="75" w:type="dxa"/>
+              <w:left w:w="75" w:type="dxa"/>
+              <w:right w:w="75" w:type="dxa"/>
+            </w:tcMar>
+            <w:shd w:fill="FFFFFF"/>
+          </w:tcPr>
+          <w:p>
+            <w:pPr>
+              <w:spacing w:after="20" w:line="259" w:lineRule="auto"/>
+            </w:pPr>
+            <w:r>
+              <w:rPr>
+                <w:b w:val="0"/>
+                <w:sz w:val="18"/>
+              </w:rPr>
+              <w:t>captureRequests</w:t>
+            </w:r>
+          </w:p>
+        </w:tc>
+        <w:tc>
+          <w:tcPr>
+            <w:tcW w:type="dxa" w:w="6973"/>
+            <w:vAlign w:val="center"/>
+            <w:tcMar>
+              <w:top w:w="75" w:type="dxa"/>
+              <w:bottom w:w="75" w:type="dxa"/>
+              <w:left w:w="75" w:type="dxa"/>
+              <w:right w:w="75" w:type="dxa"/>
+            </w:tcMar>
+            <w:shd w:fill="FFFFFF"/>
+          </w:tcPr>
+          <w:p>
+            <w:pPr>
+              <w:spacing w:after="20" w:line="259" w:lineRule="auto"/>
+            </w:pPr>
+            <w:r>
+              <w:rPr>
+                <w:b w:val="0"/>
+                <w:sz w:val="18"/>
+              </w:rPr>
+              <w:t>每站位置 序号 航段编号 飞行方向 模式 方向数</w:t>
+            </w:r>
+          </w:p>
+        </w:tc>
+      </w:tr>
+      <w:tr>
+        <w:trPr>
+          <w:cantSplit/>
+        </w:trPr>
+        <w:tc>
+          <w:tcPr>
+            <w:tcW w:type="dxa" w:w="2778"/>
+            <w:vAlign w:val="center"/>
+            <w:tcMar>
+              <w:top w:w="75" w:type="dxa"/>
+              <w:bottom w:w="75" w:type="dxa"/>
+              <w:left w:w="75" w:type="dxa"/>
+              <w:right w:w="75" w:type="dxa"/>
+            </w:tcMar>
+            <w:shd w:fill="F4F7FA"/>
+          </w:tcPr>
+          <w:p>
+            <w:pPr>
+              <w:spacing w:after="20" w:line="259" w:lineRule="auto"/>
+            </w:pPr>
+            <w:r>
+              <w:rPr>
+                <w:b w:val="0"/>
+                <w:sz w:val="18"/>
+              </w:rPr>
+              <w:t>terrain</w:t>
+            </w:r>
+          </w:p>
+        </w:tc>
+        <w:tc>
+          <w:tcPr>
+            <w:tcW w:type="dxa" w:w="6973"/>
+            <w:vAlign w:val="center"/>
+            <w:tcMar>
+              <w:top w:w="75" w:type="dxa"/>
+              <w:bottom w:w="75" w:type="dxa"/>
+              <w:left w:w="75" w:type="dxa"/>
+              <w:right w:w="75" w:type="dxa"/>
+            </w:tcMar>
+            <w:shd w:fill="F4F7FA"/>
+          </w:tcPr>
+          <w:p>
+            <w:pPr>
+              <w:spacing w:after="20" w:line="259" w:lineRule="auto"/>
+            </w:pPr>
+            <w:r>
+              <w:rPr>
+                <w:b w:val="0"/>
+                <w:sz w:val="18"/>
+              </w:rPr>
+              <w:t>ready 状态  来源  高程基准  数据层级与采样信息</w:t>
+            </w:r>
+          </w:p>
+        </w:tc>
+      </w:tr>
+      <w:tr>
+        <w:trPr>
+          <w:cantSplit/>
+        </w:trPr>
+        <w:tc>
+          <w:tcPr>
+            <w:tcW w:type="dxa" w:w="2778"/>
+            <w:vAlign w:val="center"/>
+            <w:tcMar>
+              <w:top w:w="75" w:type="dxa"/>
+              <w:bottom w:w="75" w:type="dxa"/>
+              <w:left w:w="75" w:type="dxa"/>
+              <w:right w:w="75" w:type="dxa"/>
+            </w:tcMar>
+            <w:shd w:fill="FFFFFF"/>
+          </w:tcPr>
+          <w:p>
+            <w:pPr>
+              <w:spacing w:after="20" w:line="259" w:lineRule="auto"/>
+            </w:pPr>
+            <w:r>
+              <w:rPr>
+                <w:b w:val="0"/>
+                <w:sz w:val="18"/>
+              </w:rPr>
+              <w:t>stats / warnings</w:t>
+            </w:r>
+          </w:p>
+        </w:tc>
+        <w:tc>
+          <w:tcPr>
+            <w:tcW w:type="dxa" w:w="6973"/>
+            <w:vAlign w:val="center"/>
+            <w:tcMar>
+              <w:top w:w="75" w:type="dxa"/>
+              <w:bottom w:w="75" w:type="dxa"/>
+              <w:left w:w="75" w:type="dxa"/>
+              <w:right w:w="75" w:type="dxa"/>
+            </w:tcMar>
+            <w:shd w:fill="FFFFFF"/>
+          </w:tcPr>
+          <w:p>
+            <w:pPr>
+              <w:spacing w:after="20" w:line="259" w:lineRule="auto"/>
+            </w:pPr>
+            <w:r>
+              <w:rPr>
+                <w:b w:val="0"/>
+                <w:sz w:val="18"/>
+              </w:rPr>
+              <w:t>距离 时间 数量 高程与坡度等统计 / 使用限制</w:t>
             </w:r>
           </w:p>
         </w:tc>
@@ -4247,21 +4894,39 @@
       </w:pPr>
     </w:p>
     <w:p>
+      <w:r>
+        <w:t>legs.id 从 1 编号；pass 为 1 或 2；captureRequests.stationIndex 从 0 编号。nativeAngles 和 nativeTiming 保持 null，表示没有生成 DJI 原生动作。captureModel.views 中的角度是用户近似模型，二者不能混淆。</w:t>
+      </w:r>
+    </w:p>
+    <w:p>
       <w:pPr>
         <w:pStyle w:val="Heading2"/>
       </w:pPr>
       <w:r>
-        <w:t>网页导出</w:t>
+        <w:t>JSON</w:t>
       </w:r>
     </w:p>
     <w:p>
       <w:r>
-        <w:t>JSON 外层包括 format="aeroplan"、version=1、crs="EPSG:4490"、planningStatus="unverified"，以及任务名称、ring、holes、dock、options、demo、plan 和 notes。dock 坐标仅随方案保存。</w:t>
+        <w:t>外层 format="aeroplan"、version=2、crs="EPSG:4490"、planningStatus="terrain-sampled-unverified"。包括任务状态、options、plan、heightReference 和 notes。heightReference 明确 terrainAGL 公式、verticalDatum 以及 ellipsoidConversionApplied=false。机场坐标仅作位置标记。</w:t>
+      </w:r>
+    </w:p>
+    <w:p>
+      <w:pPr>
+        <w:pStyle w:val="Heading2"/>
+      </w:pPr>
+      <w:r>
+        <w:t>CSV</w:t>
       </w:r>
     </w:p>
     <w:p>
       <w:r>
-        <w:t>CSV 以 UTF-8 BOM 编码，列为序号、经度_CGCS2000、纬度_CGCS2000、相对测区地面高度_m；经纬度保留 9 位小数，高度取 options.altitude。JSON 和 CSV 均不是 DJI WPML 或 KMZ 飞行任务文件。</w:t>
+        <w:t>文件名以“采集站高度.csv”结尾，UTF-8 BOM 编码，一站一行。列为采集站序号、经度_CGCS2000、纬度_CGCS2000、地形源高程_m、飞行绝对高程_m、离地高度_m、采集方式、每站预算照片数和高程基准。经纬度保留 9 位小数，高程保留 3 位。</w:t>
+      </w:r>
+    </w:p>
+    <w:p>
+      <w:r>
+        <w:t>导出前要求 terrain.status="ready"、高程基准非空、所有采集站高度有效。正在重算或地形失败时，旧方案不会继续供导出。JSON 可重新导入并重算；这些文件仍不是 WPML 或 KMZ 可执行飞行任务。</w:t>
       </w:r>
     </w:p>
     <w:p>
@@ -4274,12 +4939,12 @@
         <w:pStyle w:val="Heading1"/>
       </w:pPr>
       <w:r>
-        <w:t>12 可复算的矩形算例</w:t>
+        <w:t>14 可复算的更新算例</w:t>
       </w:r>
     </w:p>
     <w:p>
       <w:r>
-        <w:t>以 [116.39°,39.9°] 建立局部投影，将米制矩形 (0,0)、(300,0)、(300,200)、(0,200) 逆投影为经纬度输入。使用全部默认参数，只将 autoHeading 设为 false、heading 设为 90°。无孔洞，单网格。</w:t>
+        <w:t>在 [116.39°,39.9°] 的局部投影中构造 300×200 m 矩形，默认参数，只将 autoHeading=false、heading=90°。无孔洞，单网格。以下平面高程是可重复的测试输入，不冒充真实在线测区高程。</w:t>
       </w:r>
     </w:p>
     <w:p>
@@ -4291,13 +4956,19 @@
           <w:rFonts w:ascii="Consolas" w:hAnsi="Consolas"/>
           <w:sz w:val="18"/>
         </w:rPr>
-        <w:t>import { createLocalProjection, planMission } from './src/planner.js';</w:t>
-        <w:br/>
-        <w:t>const f = createLocalProjection([[116.39, 39.9]]);</w:t>
+        <w:t>const f = createLocalProjection([[116.39,39.9]]);</w:t>
         <w:br/>
         <w:t>const ring = [[0,0],[300,0],[300,200],[0,200]].map(f.inverse);</w:t>
         <w:br/>
-        <w:t>const plan = planMission(ring, {autoHeading:false, heading:90});</w:t>
+        <w:t>const options = {autoHeading:false,heading:90};</w:t>
+        <w:br/>
+        <w:t>const horizontal = planMission(ring,options);</w:t>
+        <w:br/>
+        <w:t>const plan = await attachTerrainToPlan(horizontal, options,</w:t>
+        <w:br/>
+        <w:t xml:space="preserve">  async points =&gt; points.map(() =&gt; 50),</w:t>
+        <w:br/>
+        <w:t xml:space="preserve">  {source:'测试平地',verticalDatum:'source-orthometric'});</w:t>
       </w:r>
     </w:p>
     <w:p>
@@ -4305,27 +4976,27 @@
         <w:pStyle w:val="Heading2"/>
       </w:pPr>
       <w:r>
-        <w:t>逐步计算</w:t>
+        <w:t>计算步骤</w:t>
       </w:r>
     </w:p>
     <w:p>
       <w:r>
-        <w:t>① 4D 像素为 5280 × 3956，视场角 84°。H=100 m，B=40 m，因此屋顶相对高度为 60 m，满足 20 m 净空要求。</w:t>
+        <w:t>① AGL=100 m；4D 像素 5280×3956、对角 FOV=84°。k≈0.0002729489325，名义 GSD≈2.729489 cm/px；下视足迹宽≈144.117036 m，长≈107.978598 m。</w:t>
       </w:r>
     </w:p>
     <w:p>
       <w:r>
-        <w:t>② k≈0.0002729489325；地面 GSD≈2.729489 cm/px，屋顶 GSD≈1.637694 cm/px。屋顶足迹 W≈86.470222 m，L≈64.787159 m。</w:t>
+        <w:t>② 旁向 80%、航向 85%：行距≈28.823407 m，站距≈16.196790 m。横向需要 ceil(200/28.823407)=7 行，实际行距约 28.571 m。</w:t>
       </w:r>
     </w:p>
     <w:p>
       <w:r>
-        <w:t>③ 旁向 80%、航向 85%，所以目标行距≈17.294044 m，目标点距≈9.718074 m。200 m 横向范围需要 ceil(200/17.294044)=12 行，实际行距约 16.667 m。</w:t>
+        <w:t>③ 每行 K=ceil(300/16.196790)=19，包含两端共 20 站，实际站距约 15.789474 m。7 行合计 140 站。垂直模式预算 140 张；三向模式预算 420 张，水平路线相同。</w:t>
       </w:r>
     </w:p>
     <w:p>
       <w:r>
-        <w:t>④ 每行约 300 m，K=ceil(300/9.718074)=31，生成 32 个点；实际点距约 9.677419 m，按 6 m/s 飞行约每 1.612903 s 拍一张。12 行合计 384 张，不需要补线。</w:t>
+        <w:t>④ 测试地形每点 50 m，则所有飞行绝对高程为 150 m。三维距离等于水平距离；在线地形起伏时，需要按逐点 Δz 重算。</w:t>
       </w:r>
     </w:p>
     <w:tbl>
@@ -4344,8 +5015,8 @@
         </w:tblBorders>
       </w:tblPr>
       <w:tblGrid>
-        <w:gridCol w:w="3458"/>
-        <w:gridCol w:w="6293"/>
+        <w:gridCol w:w="3515"/>
+        <w:gridCol w:w="6236"/>
       </w:tblGrid>
       <w:tr>
         <w:trPr>
@@ -4354,7 +5025,7 @@
         </w:trPr>
         <w:tc>
           <w:tcPr>
-            <w:tcW w:type="dxa" w:w="3458"/>
+            <w:tcW w:type="dxa" w:w="3515"/>
             <w:vAlign w:val="center"/>
             <w:tcMar>
               <w:top w:w="75" w:type="dxa"/>
@@ -4379,7 +5050,7 @@
         </w:tc>
         <w:tc>
           <w:tcPr>
-            <w:tcW w:type="dxa" w:w="6293"/>
+            <w:tcW w:type="dxa" w:w="6236"/>
             <w:vAlign w:val="center"/>
             <w:tcMar>
               <w:top w:w="75" w:type="dxa"/>
@@ -4398,7 +5069,7 @@
                 <w:b/>
                 <w:sz w:val="18"/>
               </w:rPr>
-              <w:t>代码实算值</w:t>
+              <w:t>平地代码实算值</w:t>
             </w:r>
           </w:p>
         </w:tc>
@@ -4409,7 +5080,7 @@
         </w:trPr>
         <w:tc>
           <w:tcPr>
-            <w:tcW w:type="dxa" w:w="3458"/>
+            <w:tcW w:type="dxa" w:w="3515"/>
             <w:vAlign w:val="center"/>
             <w:tcMar>
               <w:top w:w="75" w:type="dxa"/>
@@ -4428,13 +5099,13 @@
                 <w:b w:val="0"/>
                 <w:sz w:val="18"/>
               </w:rPr>
-              <w:t>净面积</w:t>
+              <w:t>面积 / 航段 / 连接</w:t>
             </w:r>
           </w:p>
         </w:tc>
         <w:tc>
           <w:tcPr>
-            <w:tcW w:type="dxa" w:w="6293"/>
+            <w:tcW w:type="dxa" w:w="6236"/>
             <w:vAlign w:val="center"/>
             <w:tcMar>
               <w:top w:w="75" w:type="dxa"/>
@@ -4453,7 +5124,7 @@
                 <w:b w:val="0"/>
                 <w:sz w:val="18"/>
               </w:rPr>
-              <w:t>59999.999541 m²  约 6 ha</w:t>
+              <w:t>59999.999541 m² / 7 段 / 6 条连接</w:t>
             </w:r>
           </w:p>
         </w:tc>
@@ -4464,7 +5135,7 @@
         </w:trPr>
         <w:tc>
           <w:tcPr>
-            <w:tcW w:type="dxa" w:w="3458"/>
+            <w:tcW w:type="dxa" w:w="3515"/>
             <w:vAlign w:val="center"/>
             <w:tcMar>
               <w:top w:w="75" w:type="dxa"/>
@@ -4483,13 +5154,13 @@
                 <w:b w:val="0"/>
                 <w:sz w:val="18"/>
               </w:rPr>
-              <w:t>拍摄航段 / 连接 / 照片</w:t>
+              <w:t>拍摄距离 / 连接距离</w:t>
             </w:r>
           </w:p>
         </w:tc>
         <w:tc>
           <w:tcPr>
-            <w:tcW w:type="dxa" w:w="6293"/>
+            <w:tcW w:type="dxa" w:w="6236"/>
             <w:vAlign w:val="center"/>
             <w:tcMar>
               <w:top w:w="75" w:type="dxa"/>
@@ -4508,7 +5179,7 @@
                 <w:b w:val="0"/>
                 <w:sz w:val="18"/>
               </w:rPr>
-              <w:t>12 段 / 11 条连接 / 384 张</w:t>
+              <w:t>2099.999984 m / 171.433621 m</w:t>
             </w:r>
           </w:p>
         </w:tc>
@@ -4519,117 +5190,7 @@
         </w:trPr>
         <w:tc>
           <w:tcPr>
-            <w:tcW w:type="dxa" w:w="3458"/>
-            <w:vAlign w:val="center"/>
-            <w:tcMar>
-              <w:top w:w="75" w:type="dxa"/>
-              <w:bottom w:w="75" w:type="dxa"/>
-              <w:left w:w="75" w:type="dxa"/>
-              <w:right w:w="75" w:type="dxa"/>
-            </w:tcMar>
-            <w:shd w:fill="FFFFFF"/>
-          </w:tcPr>
-          <w:p>
-            <w:pPr>
-              <w:spacing w:after="20" w:line="259" w:lineRule="auto"/>
-            </w:pPr>
-            <w:r>
-              <w:rPr>
-                <w:b w:val="0"/>
-                <w:sz w:val="18"/>
-              </w:rPr>
-              <w:t>拍摄距离</w:t>
-            </w:r>
-          </w:p>
-        </w:tc>
-        <w:tc>
-          <w:tcPr>
-            <w:tcW w:type="dxa" w:w="6293"/>
-            <w:vAlign w:val="center"/>
-            <w:tcMar>
-              <w:top w:w="75" w:type="dxa"/>
-              <w:bottom w:w="75" w:type="dxa"/>
-              <w:left w:w="75" w:type="dxa"/>
-              <w:right w:w="75" w:type="dxa"/>
-            </w:tcMar>
-            <w:shd w:fill="FFFFFF"/>
-          </w:tcPr>
-          <w:p>
-            <w:pPr>
-              <w:spacing w:after="20" w:line="259" w:lineRule="auto"/>
-            </w:pPr>
-            <w:r>
-              <w:rPr>
-                <w:b w:val="0"/>
-                <w:sz w:val="18"/>
-              </w:rPr>
-              <w:t>3599.999973 m</w:t>
-            </w:r>
-          </w:p>
-        </w:tc>
-      </w:tr>
-      <w:tr>
-        <w:trPr>
-          <w:cantSplit/>
-        </w:trPr>
-        <w:tc>
-          <w:tcPr>
-            <w:tcW w:type="dxa" w:w="3458"/>
-            <w:vAlign w:val="center"/>
-            <w:tcMar>
-              <w:top w:w="75" w:type="dxa"/>
-              <w:bottom w:w="75" w:type="dxa"/>
-              <w:left w:w="75" w:type="dxa"/>
-              <w:right w:w="75" w:type="dxa"/>
-            </w:tcMar>
-            <w:shd w:fill="F4F7FA"/>
-          </w:tcPr>
-          <w:p>
-            <w:pPr>
-              <w:spacing w:after="20" w:line="259" w:lineRule="auto"/>
-            </w:pPr>
-            <w:r>
-              <w:rPr>
-                <w:b w:val="0"/>
-                <w:sz w:val="18"/>
-              </w:rPr>
-              <w:t>连接距离</w:t>
-            </w:r>
-          </w:p>
-        </w:tc>
-        <w:tc>
-          <w:tcPr>
-            <w:tcW w:type="dxa" w:w="6293"/>
-            <w:vAlign w:val="center"/>
-            <w:tcMar>
-              <w:top w:w="75" w:type="dxa"/>
-              <w:bottom w:w="75" w:type="dxa"/>
-              <w:left w:w="75" w:type="dxa"/>
-              <w:right w:w="75" w:type="dxa"/>
-            </w:tcMar>
-            <w:shd w:fill="F4F7FA"/>
-          </w:tcPr>
-          <w:p>
-            <w:pPr>
-              <w:spacing w:after="20" w:line="259" w:lineRule="auto"/>
-            </w:pPr>
-            <w:r>
-              <w:rPr>
-                <w:b w:val="0"/>
-                <w:sz w:val="18"/>
-              </w:rPr>
-              <w:t>183.338734 m</w:t>
-            </w:r>
-          </w:p>
-        </w:tc>
-      </w:tr>
-      <w:tr>
-        <w:trPr>
-          <w:cantSplit/>
-        </w:trPr>
-        <w:tc>
-          <w:tcPr>
-            <w:tcW w:type="dxa" w:w="3458"/>
+            <w:tcW w:type="dxa" w:w="3515"/>
             <w:vAlign w:val="center"/>
             <w:tcMar>
               <w:top w:w="75" w:type="dxa"/>
@@ -4654,7 +5215,7 @@
         </w:tc>
         <w:tc>
           <w:tcPr>
-            <w:tcW w:type="dxa" w:w="6293"/>
+            <w:tcW w:type="dxa" w:w="6236"/>
             <w:vAlign w:val="center"/>
             <w:tcMar>
               <w:top w:w="75" w:type="dxa"/>
@@ -4673,7 +5234,7 @@
                 <w:b w:val="0"/>
                 <w:sz w:val="18"/>
               </w:rPr>
-              <w:t>3783.338707 m</w:t>
+              <w:t>2271.433605 m</w:t>
             </w:r>
           </w:p>
         </w:tc>
@@ -4684,7 +5245,7 @@
         </w:trPr>
         <w:tc>
           <w:tcPr>
-            <w:tcW w:type="dxa" w:w="3458"/>
+            <w:tcW w:type="dxa" w:w="3515"/>
             <w:vAlign w:val="center"/>
             <w:tcMar>
               <w:top w:w="75" w:type="dxa"/>
@@ -4703,13 +5264,13 @@
                 <w:b w:val="0"/>
                 <w:sz w:val="18"/>
               </w:rPr>
-              <w:t>预计时间</w:t>
+              <w:t>区内预计时间</w:t>
             </w:r>
           </w:p>
         </w:tc>
         <w:tc>
           <w:tcPr>
-            <w:tcW w:type="dxa" w:w="6293"/>
+            <w:tcW w:type="dxa" w:w="6236"/>
             <w:vAlign w:val="center"/>
             <w:tcMar>
               <w:top w:w="75" w:type="dxa"/>
@@ -4728,64 +5289,9 @@
                 <w:b w:val="0"/>
                 <w:sz w:val="18"/>
               </w:rPr>
-              <w:t>3783.338707 / 6 + 11 × 3</w:t>
+              <w:t>2271.433605/6 + 6×3 = 396.572268 s</w:t>
               <w:br/>
-              <w:t>= 663.556451 s  约 11.059274 min</w:t>
-            </w:r>
-          </w:p>
-        </w:tc>
-      </w:tr>
-      <w:tr>
-        <w:trPr>
-          <w:cantSplit/>
-        </w:trPr>
-        <w:tc>
-          <w:tcPr>
-            <w:tcW w:type="dxa" w:w="3458"/>
-            <w:vAlign w:val="center"/>
-            <w:tcMar>
-              <w:top w:w="75" w:type="dxa"/>
-              <w:bottom w:w="75" w:type="dxa"/>
-              <w:left w:w="75" w:type="dxa"/>
-              <w:right w:w="75" w:type="dxa"/>
-            </w:tcMar>
-            <w:shd w:fill="FFFFFF"/>
-          </w:tcPr>
-          <w:p>
-            <w:pPr>
-              <w:spacing w:after="20" w:line="259" w:lineRule="auto"/>
-            </w:pPr>
-            <w:r>
-              <w:rPr>
-                <w:b w:val="0"/>
-                <w:sz w:val="18"/>
-              </w:rPr>
-              <w:t>建筑净空 / 相对机场高度</w:t>
-            </w:r>
-          </w:p>
-        </w:tc>
-        <w:tc>
-          <w:tcPr>
-            <w:tcW w:type="dxa" w:w="6293"/>
-            <w:vAlign w:val="center"/>
-            <w:tcMar>
-              <w:top w:w="75" w:type="dxa"/>
-              <w:bottom w:w="75" w:type="dxa"/>
-              <w:left w:w="75" w:type="dxa"/>
-              <w:right w:w="75" w:type="dxa"/>
-            </w:tcMar>
-            <w:shd w:fill="FFFFFF"/>
-          </w:tcPr>
-          <w:p>
-            <w:pPr>
-              <w:spacing w:after="20" w:line="259" w:lineRule="auto"/>
-            </w:pPr>
-            <w:r>
-              <w:rPr>
-                <w:b w:val="0"/>
-                <w:sz w:val="18"/>
-              </w:rPr>
-              <w:t>60 m / 60 m</w:t>
+              <w:t>约 6.609538 min  不含三向摆动周期</w:t>
             </w:r>
           </w:p>
         </w:tc>
@@ -4797,8 +5303,16 @@
       </w:pPr>
     </w:p>
     <w:p>
+      <w:pPr>
+        <w:pStyle w:val="Heading2"/>
+      </w:pPr>
       <w:r>
-        <w:t>引擎会按矩形经纬度顶点均值重新建立局部投影，因此实际投影矩形与最初的 300 × 200 m 坐标存在毫米量级差异。表中是代码实算值，手工矩形估算应保留合理容差。</w:t>
+        <w:t>斜坡的独立验算</w:t>
+      </w:r>
+    </w:p>
+    <w:p>
+      <w:r>
+        <w:t>若一条 100 m 东向水平航段的地形由 0 m 线性上升至 50 m，AGL=100 m，则飞行绝对高程从 100 m 升至 150 m；三维长度 √(100²+50²)=111.803399 m。三维航速 6 m/s 时行进约 18.633900 s，所需爬升约 2.683282 m/s。</w:t>
       </w:r>
     </w:p>
     <w:p>
@@ -4811,7 +5325,7 @@
         <w:pStyle w:val="Heading1"/>
       </w:pPr>
       <w:r>
-        <w:t>13 错误处理与真实采集边界</w:t>
+        <w:t>15 错误处理与适用边界</w:t>
       </w:r>
     </w:p>
     <w:tbl>
@@ -4830,8 +5344,8 @@
         </w:tblBorders>
       </w:tblPr>
       <w:tblGrid>
-        <w:gridCol w:w="2608"/>
-        <w:gridCol w:w="7143"/>
+        <w:gridCol w:w="2721"/>
+        <w:gridCol w:w="7030"/>
       </w:tblGrid>
       <w:tr>
         <w:trPr>
@@ -4840,7 +5354,7 @@
         </w:trPr>
         <w:tc>
           <w:tcPr>
-            <w:tcW w:type="dxa" w:w="2608"/>
+            <w:tcW w:type="dxa" w:w="2721"/>
             <w:vAlign w:val="center"/>
             <w:tcMar>
               <w:top w:w="75" w:type="dxa"/>
@@ -4865,7 +5379,7 @@
         </w:tc>
         <w:tc>
           <w:tcPr>
-            <w:tcW w:type="dxa" w:w="7143"/>
+            <w:tcW w:type="dxa" w:w="7030"/>
             <w:vAlign w:val="center"/>
             <w:tcMar>
               <w:top w:w="75" w:type="dxa"/>
@@ -4895,7 +5409,7 @@
         </w:trPr>
         <w:tc>
           <w:tcPr>
-            <w:tcW w:type="dxa" w:w="2608"/>
+            <w:tcW w:type="dxa" w:w="2721"/>
             <w:vAlign w:val="center"/>
             <w:tcMar>
               <w:top w:w="75" w:type="dxa"/>
@@ -4914,13 +5428,13 @@
                 <w:b w:val="0"/>
                 <w:sz w:val="18"/>
               </w:rPr>
-              <w:t>边界非法</w:t>
+              <w:t>几何与参数</w:t>
             </w:r>
           </w:p>
         </w:tc>
         <w:tc>
           <w:tcPr>
-            <w:tcW w:type="dxa" w:w="7143"/>
+            <w:tcW w:type="dxa" w:w="7030"/>
             <w:vAlign w:val="center"/>
             <w:tcMar>
               <w:top w:w="75" w:type="dxa"/>
@@ -4939,7 +5453,7 @@
                 <w:b w:val="0"/>
                 <w:sz w:val="18"/>
               </w:rPr>
-              <w:t>自交 接触 重叠边 过短边 面积不足</w:t>
+              <w:t>自交 接触 过近点 孔洞非法 非有限数或参数越界</w:t>
             </w:r>
           </w:p>
         </w:tc>
@@ -4950,7 +5464,7 @@
         </w:trPr>
         <w:tc>
           <w:tcPr>
-            <w:tcW w:type="dxa" w:w="2608"/>
+            <w:tcW w:type="dxa" w:w="2721"/>
             <w:vAlign w:val="center"/>
             <w:tcMar>
               <w:top w:w="75" w:type="dxa"/>
@@ -4969,13 +5483,13 @@
                 <w:b w:val="0"/>
                 <w:sz w:val="18"/>
               </w:rPr>
-              <w:t>孔洞非法</w:t>
+              <w:t>机型与角度</w:t>
             </w:r>
           </w:p>
         </w:tc>
         <w:tc>
           <w:tcPr>
-            <w:tcW w:type="dxa" w:w="7143"/>
+            <w:tcW w:type="dxa" w:w="7030"/>
             <w:vAlign w:val="center"/>
             <w:tcMar>
               <w:top w:w="75" w:type="dxa"/>
@@ -4994,7 +5508,7 @@
                 <w:b w:val="0"/>
                 <w:sz w:val="18"/>
               </w:rPr>
-              <w:t>出界 接触外环 相交 接触或嵌套其他孔洞</w:t>
+              <w:t>4TD 不接受 smartOrtho  近似俯仰与偏航超范围则拒绝</w:t>
             </w:r>
           </w:p>
         </w:tc>
@@ -5005,7 +5519,7 @@
         </w:trPr>
         <w:tc>
           <w:tcPr>
-            <w:tcW w:type="dxa" w:w="2608"/>
+            <w:tcW w:type="dxa" w:w="2721"/>
             <w:vAlign w:val="center"/>
             <w:tcMar>
               <w:top w:w="75" w:type="dxa"/>
@@ -5024,13 +5538,13 @@
                 <w:b w:val="0"/>
                 <w:sz w:val="18"/>
               </w:rPr>
-              <w:t>范围与容量</w:t>
+              <w:t>容量</w:t>
             </w:r>
           </w:p>
         </w:tc>
         <w:tc>
           <w:tcPr>
-            <w:tcW w:type="dxa" w:w="7143"/>
+            <w:tcW w:type="dxa" w:w="7030"/>
             <w:vAlign w:val="center"/>
             <w:tcMar>
               <w:top w:w="75" w:type="dxa"/>
@@ -5049,9 +5563,9 @@
                 <w:b w:val="0"/>
                 <w:sz w:val="18"/>
               </w:rPr>
-              <w:t>顶点 &gt;180  轴向跨度 &gt;30 km</w:t>
+              <w:t>总顶点 180  轴向跨度 30 km  航段 4000</w:t>
               <w:br/>
-              <w:t>航段 &gt;4000  照片 &gt;15000</w:t>
+              <w:t>预算照片 15000  唯一地形点 50000</w:t>
             </w:r>
           </w:p>
         </w:tc>
@@ -5062,7 +5576,7 @@
         </w:trPr>
         <w:tc>
           <w:tcPr>
-            <w:tcW w:type="dxa" w:w="2608"/>
+            <w:tcW w:type="dxa" w:w="2721"/>
             <w:vAlign w:val="center"/>
             <w:tcMar>
               <w:top w:w="75" w:type="dxa"/>
@@ -5081,13 +5595,13 @@
                 <w:b w:val="0"/>
                 <w:sz w:val="18"/>
               </w:rPr>
-              <w:t>参数非法</w:t>
+              <w:t>地形失败</w:t>
             </w:r>
           </w:p>
         </w:tc>
         <w:tc>
           <w:tcPr>
-            <w:tcW w:type="dxa" w:w="7143"/>
+            <w:tcW w:type="dxa" w:w="7030"/>
             <w:vAlign w:val="center"/>
             <w:tcMar>
               <w:top w:w="75" w:type="dxa"/>
@@ -5106,7 +5620,7 @@
                 <w:b w:val="0"/>
                 <w:sz w:val="18"/>
               </w:rPr>
-              <w:t>非有限数 无效相机 非布尔开关 超出允许范围</w:t>
+              <w:t>缺瓦片 缺高程 无效解码 超时  不以 0 替代</w:t>
             </w:r>
           </w:p>
         </w:tc>
@@ -5117,7 +5631,7 @@
         </w:trPr>
         <w:tc>
           <w:tcPr>
-            <w:tcW w:type="dxa" w:w="2608"/>
+            <w:tcW w:type="dxa" w:w="2721"/>
             <w:vAlign w:val="center"/>
             <w:tcMar>
               <w:top w:w="75" w:type="dxa"/>
@@ -5136,13 +5650,13 @@
                 <w:b w:val="0"/>
                 <w:sz w:val="18"/>
               </w:rPr>
-              <w:t>航高不足</w:t>
+              <w:t>过快拍照</w:t>
             </w:r>
           </w:p>
         </w:tc>
         <w:tc>
           <w:tcPr>
-            <w:tcW w:type="dxa" w:w="7143"/>
+            <w:tcW w:type="dxa" w:w="7030"/>
             <w:vAlign w:val="center"/>
             <w:tcMar>
               <w:top w:w="75" w:type="dxa"/>
@@ -5161,7 +5675,7 @@
                 <w:b w:val="0"/>
                 <w:sz w:val="18"/>
               </w:rPr>
-              <w:t>H−B ≤0 或低于 clearance  直接报错</w:t>
+              <w:t>站间时间不足  提示复核速度和原生摆拍周期</w:t>
             </w:r>
           </w:p>
         </w:tc>
@@ -5172,7 +5686,7 @@
         </w:trPr>
         <w:tc>
           <w:tcPr>
-            <w:tcW w:type="dxa" w:w="2608"/>
+            <w:tcW w:type="dxa" w:w="2721"/>
             <w:vAlign w:val="center"/>
             <w:tcMar>
               <w:top w:w="75" w:type="dxa"/>
@@ -5191,13 +5705,13 @@
                 <w:b w:val="0"/>
                 <w:sz w:val="18"/>
               </w:rPr>
-              <w:t>拍照过快</w:t>
+              <w:t>地形过陡</w:t>
             </w:r>
           </w:p>
         </w:tc>
         <w:tc>
           <w:tcPr>
-            <w:tcW w:type="dxa" w:w="7143"/>
+            <w:tcW w:type="dxa" w:w="7030"/>
             <w:vAlign w:val="center"/>
             <w:tcMar>
               <w:top w:w="75" w:type="dxa"/>
@@ -5216,7 +5730,7 @@
                 <w:b w:val="0"/>
                 <w:sz w:val="18"/>
               </w:rPr>
-              <w:t>实际最小点距/speed 小于参考间隔  仅提示</w:t>
+              <w:t>按采样点提示坡度与所需垂速  不自动减速</w:t>
             </w:r>
           </w:p>
         </w:tc>
@@ -5227,7 +5741,7 @@
         </w:trPr>
         <w:tc>
           <w:tcPr>
-            <w:tcW w:type="dxa" w:w="2608"/>
+            <w:tcW w:type="dxa" w:w="2721"/>
             <w:vAlign w:val="center"/>
             <w:tcMar>
               <w:top w:w="75" w:type="dxa"/>
@@ -5246,13 +5760,13 @@
                 <w:b w:val="0"/>
                 <w:sz w:val="18"/>
               </w:rPr>
-              <w:t>机场高于航线</w:t>
+              <w:t>补线或连接失败</w:t>
             </w:r>
           </w:p>
         </w:tc>
         <w:tc>
           <w:tcPr>
-            <w:tcW w:type="dxa" w:w="7143"/>
+            <w:tcW w:type="dxa" w:w="7030"/>
             <w:vAlign w:val="center"/>
             <w:tcMar>
               <w:top w:w="75" w:type="dxa"/>
@@ -5271,62 +5785,7 @@
                 <w:b w:val="0"/>
                 <w:sz w:val="18"/>
               </w:rPr>
-              <w:t>H ≤dockHeight  提示单独规划出场下降路线</w:t>
-            </w:r>
-          </w:p>
-        </w:tc>
-      </w:tr>
-      <w:tr>
-        <w:trPr>
-          <w:cantSplit/>
-        </w:trPr>
-        <w:tc>
-          <w:tcPr>
-            <w:tcW w:type="dxa" w:w="2608"/>
-            <w:vAlign w:val="center"/>
-            <w:tcMar>
-              <w:top w:w="75" w:type="dxa"/>
-              <w:bottom w:w="75" w:type="dxa"/>
-              <w:left w:w="75" w:type="dxa"/>
-              <w:right w:w="75" w:type="dxa"/>
-            </w:tcMar>
-            <w:shd w:fill="F4F7FA"/>
-          </w:tcPr>
-          <w:p>
-            <w:pPr>
-              <w:spacing w:after="20" w:line="259" w:lineRule="auto"/>
-            </w:pPr>
-            <w:r>
-              <w:rPr>
-                <w:b w:val="0"/>
-                <w:sz w:val="18"/>
-              </w:rPr>
-              <w:t>补线或连接失败</w:t>
-            </w:r>
-          </w:p>
-        </w:tc>
-        <w:tc>
-          <w:tcPr>
-            <w:tcW w:type="dxa" w:w="7143"/>
-            <w:vAlign w:val="center"/>
-            <w:tcMar>
-              <w:top w:w="75" w:type="dxa"/>
-              <w:bottom w:w="75" w:type="dxa"/>
-              <w:left w:w="75" w:type="dxa"/>
-              <w:right w:w="75" w:type="dxa"/>
-            </w:tcMar>
-            <w:shd w:fill="F4F7FA"/>
-          </w:tcPr>
-          <w:p>
-            <w:pPr>
-              <w:spacing w:after="20" w:line="259" w:lineRule="auto"/>
-            </w:pPr>
-            <w:r>
-              <w:rPr>
-                <w:b w:val="0"/>
-                <w:sz w:val="18"/>
-              </w:rPr>
-              <w:t>要求简化区域 拆分作业区或调整排除区</w:t>
+              <w:t>要求简化边界 调整排除区或拆分区域</w:t>
             </w:r>
           </w:p>
         </w:tc>
@@ -5342,12 +5801,12 @@
         <w:pStyle w:val="Heading2"/>
       </w:pPr>
       <w:r>
-        <w:t>当前已实现</w:t>
+        <w:t>本版本完成的计算</w:t>
       </w:r>
     </w:p>
     <w:p>
       <w:r>
-        <w:t>支持合法凹多边形、多个内部孔洞、固定平面单网格或双网格扫描、细长区域近似足迹补线、二维区内连接、逐段均匀拍照点与统计。天地图和 Cesium 提供交互与显示，不参与照片间距或最短连接的计算。</w:t>
+        <w:t>支持任意合法凹多边形和内部孔洞，完成水平扫描、补线、区内绕行、用户近似三向姿态、足迹示意、在线 DEM 采样与带高程路线。高程采样与地图地形共享同一开放数据源。</w:t>
       </w:r>
     </w:p>
     <w:p>
@@ -5355,17 +5814,17 @@
         <w:pStyle w:val="Heading2"/>
       </w:pPr>
       <w:r>
-        <w:t>真正射采集仍需补充的能力</w:t>
+        <w:t>当前不作出的保证</w:t>
       </w:r>
     </w:p>
     <w:p>
       <w:r>
-        <w:t>DSM 与建筑模型应参与每张照片的可见性检查，识别街巷、屋顶边缘和高楼之间的遮挡；需要按重建目标检查多视覆盖，而不仅是足迹并集。相机标定、真实照片模式和定位精度也需进入质量设计。</w:t>
+        <w:t>固定 AGL 不等于跨越建筑的净空。地形源不是完整 DSM，模型不包含线缆、树木或机场屋顶避障；当前也不验证每张倾斜影像与真实坡面的交点、街巷可见性或真正射成果完整性。</w:t>
       </w:r>
     </w:p>
     <w:p>
       <w:r>
-        <w:t>飞行执行还需要水平净空、转弯半径、机场进出与返航、起降爬升、速度和动作约束、风与电量分架次，以及适配大疆任务格式的导出和验证。这些是后续工程能力，不是当前算法返回成功时已经完成的检查。</w:t>
+        <w:t>三向足迹与预算是用户给定姿态下的工程近似；原生任务是否接受这些姿态、怎样摆动及曝光，仍需 DJI 任务文件和现场验证。精确飞行还需要坐标与垂直基准转换、转弯和爬升能力、机场进出、风、电量和分架次。</w:t>
       </w:r>
     </w:p>
     <w:p>
@@ -5373,12 +5832,17 @@
         <w:pStyle w:val="Heading2"/>
       </w:pPr>
       <w:r>
-        <w:t>坐标导入注意点</w:t>
+        <w:t>坐标与公开服务</w:t>
       </w:r>
     </w:p>
     <w:p>
       <w:r>
-        <w:t>网页支持单个 GeoJSON Polygon，并接受 EPSG:4490 或 EPSG:4326 经纬度标记；WGS84 输入没有执行测绘级基准转换，会提示核对边界。不要把 GCJ-02、BD-09 偏移坐标或 Web Mercator 米制坐标直接当作本接口经纬度。</w:t>
+        <w:t>天地图 EPSG:4490 底图继续保留；地形瓦片按 WGS84 Web Mercator 索引，未进行测绘级水平基准转换。导入仍只接受单个 GeoJSON Polygon 的 4490 或 4326 经纬度，不接受直接混入 GCJ-02、BD-09 或墨卡托米制坐标。</w:t>
+      </w:r>
+    </w:p>
+    <w:p>
+      <w:r>
+        <w:t>在线服务可用性与原始数据精度会变化。网页显示采样状态和来源，失败时允许重试。地形源正高在 Cesium 中作近似显示，不能当作已转换的椭球高导入飞机。</w:t>
       </w:r>
     </w:p>
     <w:p>
@@ -5391,7 +5855,7 @@
         <w:pStyle w:val="Heading1"/>
       </w:pPr>
       <w:r>
-        <w:t>14 实现定位与验证方法</w:t>
+        <w:t>16 实现定位与验证方法</w:t>
       </w:r>
     </w:p>
     <w:tbl>
@@ -5410,8 +5874,8 @@
         </w:tblBorders>
       </w:tblPr>
       <w:tblGrid>
-        <w:gridCol w:w="3742"/>
-        <w:gridCol w:w="6009"/>
+        <w:gridCol w:w="3685"/>
+        <w:gridCol w:w="6066"/>
       </w:tblGrid>
       <w:tr>
         <w:trPr>
@@ -5420,7 +5884,7 @@
         </w:trPr>
         <w:tc>
           <w:tcPr>
-            <w:tcW w:type="dxa" w:w="3742"/>
+            <w:tcW w:type="dxa" w:w="3685"/>
             <w:vAlign w:val="center"/>
             <w:tcMar>
               <w:top w:w="75" w:type="dxa"/>
@@ -5439,13 +5903,13 @@
                 <w:b/>
                 <w:sz w:val="18"/>
               </w:rPr>
-              <w:t>源码位置</w:t>
+              <w:t>源码</w:t>
             </w:r>
           </w:p>
         </w:tc>
         <w:tc>
           <w:tcPr>
-            <w:tcW w:type="dxa" w:w="6009"/>
+            <w:tcW w:type="dxa" w:w="6066"/>
             <w:vAlign w:val="center"/>
             <w:tcMar>
               <w:top w:w="75" w:type="dxa"/>
@@ -5475,7 +5939,7 @@
         </w:trPr>
         <w:tc>
           <w:tcPr>
-            <w:tcW w:type="dxa" w:w="3742"/>
+            <w:tcW w:type="dxa" w:w="3685"/>
             <w:vAlign w:val="center"/>
             <w:tcMar>
               <w:top w:w="75" w:type="dxa"/>
@@ -5494,13 +5958,13 @@
                 <w:b w:val="0"/>
                 <w:sz w:val="18"/>
               </w:rPr>
-              <w:t>src/planner.js  32 行</w:t>
+              <w:t>src/planner.js</w:t>
             </w:r>
           </w:p>
         </w:tc>
         <w:tc>
           <w:tcPr>
-            <w:tcW w:type="dxa" w:w="6009"/>
+            <w:tcW w:type="dxa" w:w="6066"/>
             <w:vAlign w:val="center"/>
             <w:tcMar>
               <w:top w:w="75" w:type="dxa"/>
@@ -5519,7 +5983,7 @@
                 <w:b w:val="0"/>
                 <w:sz w:val="18"/>
               </w:rPr>
-              <w:t>createLocalProjection  建立 GRS80 局部投影</w:t>
+              <w:t>参数校验 局部投影 扫描 補线 最短连接与采集站</w:t>
             </w:r>
           </w:p>
         </w:tc>
@@ -5530,7 +5994,7 @@
         </w:trPr>
         <w:tc>
           <w:tcPr>
-            <w:tcW w:type="dxa" w:w="3742"/>
+            <w:tcW w:type="dxa" w:w="3685"/>
             <w:vAlign w:val="center"/>
             <w:tcMar>
               <w:top w:w="75" w:type="dxa"/>
@@ -5549,13 +6013,13 @@
                 <w:b w:val="0"/>
                 <w:sz w:val="18"/>
               </w:rPr>
-              <w:t>src/planner.js  105 和 140 行</w:t>
+              <w:t>src/capture-geometry.js</w:t>
             </w:r>
           </w:p>
         </w:tc>
         <w:tc>
           <w:tcPr>
-            <w:tcW w:type="dxa" w:w="6009"/>
+            <w:tcW w:type="dxa" w:w="6066"/>
             <w:vAlign w:val="center"/>
             <w:tcMar>
               <w:top w:w="75" w:type="dxa"/>
@@ -5574,7 +6038,7 @@
                 <w:b w:val="0"/>
                 <w:sz w:val="18"/>
               </w:rPr>
-              <w:t>preparePolygon / validateOptions  校验输入</w:t>
+              <w:t>用户近似姿态  相机射线与水平面求交</w:t>
             </w:r>
           </w:p>
         </w:tc>
@@ -5585,7 +6049,7 @@
         </w:trPr>
         <w:tc>
           <w:tcPr>
-            <w:tcW w:type="dxa" w:w="3742"/>
+            <w:tcW w:type="dxa" w:w="3685"/>
             <w:vAlign w:val="center"/>
             <w:tcMar>
               <w:top w:w="75" w:type="dxa"/>
@@ -5604,13 +6068,13 @@
                 <w:b w:val="0"/>
                 <w:sz w:val="18"/>
               </w:rPr>
-              <w:t>src/planner.js  157 行</w:t>
+              <w:t>src/terrain-source.js</w:t>
             </w:r>
           </w:p>
         </w:tc>
         <w:tc>
           <w:tcPr>
-            <w:tcW w:type="dxa" w:w="6009"/>
+            <w:tcW w:type="dxa" w:w="6066"/>
             <w:vAlign w:val="center"/>
             <w:tcMar>
               <w:top w:w="75" w:type="dxa"/>
@@ -5629,7 +6093,7 @@
                 <w:b w:val="0"/>
                 <w:sz w:val="18"/>
               </w:rPr>
-              <w:t>cameraGeometry  GSD 与间距</w:t>
+              <w:t>Terrarium解码 跨瓦片插值 缓存与Cesium地形</w:t>
             </w:r>
           </w:p>
         </w:tc>
@@ -5640,7 +6104,7 @@
         </w:trPr>
         <w:tc>
           <w:tcPr>
-            <w:tcW w:type="dxa" w:w="3742"/>
+            <w:tcW w:type="dxa" w:w="3685"/>
             <w:vAlign w:val="center"/>
             <w:tcMar>
               <w:top w:w="75" w:type="dxa"/>
@@ -5659,13 +6123,13 @@
                 <w:b w:val="0"/>
                 <w:sz w:val="18"/>
               </w:rPr>
-              <w:t>src/planner.js  170 至 206 行</w:t>
+              <w:t>src/terrain-route.js</w:t>
             </w:r>
           </w:p>
         </w:tc>
         <w:tc>
           <w:tcPr>
-            <w:tcW w:type="dxa" w:w="6009"/>
+            <w:tcW w:type="dxa" w:w="6066"/>
             <w:vAlign w:val="center"/>
             <w:tcMar>
               <w:top w:w="75" w:type="dxa"/>
@@ -5684,7 +6148,7 @@
                 <w:b w:val="0"/>
                 <w:sz w:val="18"/>
               </w:rPr>
-              <w:t>scanFrame / orderScanRows / makeScan  扫描裁剪排序</w:t>
+              <w:t>米制路线加密 批量采样 逐点赋高 三维统计</w:t>
             </w:r>
           </w:p>
         </w:tc>
@@ -5695,7 +6159,7 @@
         </w:trPr>
         <w:tc>
           <w:tcPr>
-            <w:tcW w:type="dxa" w:w="3742"/>
+            <w:tcW w:type="dxa" w:w="3685"/>
             <w:vAlign w:val="center"/>
             <w:tcMar>
               <w:top w:w="75" w:type="dxa"/>
@@ -5714,13 +6178,13 @@
                 <w:b w:val="0"/>
                 <w:sz w:val="18"/>
               </w:rPr>
-              <w:t>src/planner.js  225 行</w:t>
+              <w:t>src/mission-export.js</w:t>
             </w:r>
           </w:p>
         </w:tc>
         <w:tc>
           <w:tcPr>
-            <w:tcW w:type="dxa" w:w="6009"/>
+            <w:tcW w:type="dxa" w:w="6066"/>
             <w:vAlign w:val="center"/>
             <w:tcMar>
               <w:top w:w="75" w:type="dxa"/>
@@ -5739,7 +6203,7 @@
                 <w:b w:val="0"/>
                 <w:sz w:val="18"/>
               </w:rPr>
-              <w:t>completeFlatCoverage  足迹并集补线</w:t>
+              <w:t>JSON v2 与采集站高度 CSV  导出条件检查</w:t>
             </w:r>
           </w:p>
         </w:tc>
@@ -5750,117 +6214,7 @@
         </w:trPr>
         <w:tc>
           <w:tcPr>
-            <w:tcW w:type="dxa" w:w="3742"/>
-            <w:vAlign w:val="center"/>
-            <w:tcMar>
-              <w:top w:w="75" w:type="dxa"/>
-              <w:bottom w:w="75" w:type="dxa"/>
-              <w:left w:w="75" w:type="dxa"/>
-              <w:right w:w="75" w:type="dxa"/>
-            </w:tcMar>
-            <w:shd w:fill="F4F7FA"/>
-          </w:tcPr>
-          <w:p>
-            <w:pPr>
-              <w:spacing w:after="20" w:line="259" w:lineRule="auto"/>
-            </w:pPr>
-            <w:r>
-              <w:rPr>
-                <w:b w:val="0"/>
-                <w:sz w:val="18"/>
-              </w:rPr>
-              <w:t>src/planner.js  277 和 286 行</w:t>
-            </w:r>
-          </w:p>
-        </w:tc>
-        <w:tc>
-          <w:tcPr>
-            <w:tcW w:type="dxa" w:w="6009"/>
-            <w:vAlign w:val="center"/>
-            <w:tcMar>
-              <w:top w:w="75" w:type="dxa"/>
-              <w:bottom w:w="75" w:type="dxa"/>
-              <w:left w:w="75" w:type="dxa"/>
-              <w:right w:w="75" w:type="dxa"/>
-            </w:tcMar>
-            <w:shd w:fill="F4F7FA"/>
-          </w:tcPr>
-          <w:p>
-            <w:pPr>
-              <w:spacing w:after="20" w:line="259" w:lineRule="auto"/>
-            </w:pPr>
-            <w:r>
-              <w:rPr>
-                <w:b w:val="0"/>
-                <w:sz w:val="18"/>
-              </w:rPr>
-              <w:t>approximateCost / createNavigator  评分与连接</w:t>
-            </w:r>
-          </w:p>
-        </w:tc>
-      </w:tr>
-      <w:tr>
-        <w:trPr>
-          <w:cantSplit/>
-        </w:trPr>
-        <w:tc>
-          <w:tcPr>
-            <w:tcW w:type="dxa" w:w="3742"/>
-            <w:vAlign w:val="center"/>
-            <w:tcMar>
-              <w:top w:w="75" w:type="dxa"/>
-              <w:bottom w:w="75" w:type="dxa"/>
-              <w:left w:w="75" w:type="dxa"/>
-              <w:right w:w="75" w:type="dxa"/>
-            </w:tcMar>
-            <w:shd w:fill="FFFFFF"/>
-          </w:tcPr>
-          <w:p>
-            <w:pPr>
-              <w:spacing w:after="20" w:line="259" w:lineRule="auto"/>
-            </w:pPr>
-            <w:r>
-              <w:rPr>
-                <w:b w:val="0"/>
-                <w:sz w:val="18"/>
-              </w:rPr>
-              <w:t>src/planner.js  349 行</w:t>
-            </w:r>
-          </w:p>
-        </w:tc>
-        <w:tc>
-          <w:tcPr>
-            <w:tcW w:type="dxa" w:w="6009"/>
-            <w:vAlign w:val="center"/>
-            <w:tcMar>
-              <w:top w:w="75" w:type="dxa"/>
-              <w:bottom w:w="75" w:type="dxa"/>
-              <w:left w:w="75" w:type="dxa"/>
-              <w:right w:w="75" w:type="dxa"/>
-            </w:tcMar>
-            <w:shd w:fill="FFFFFF"/>
-          </w:tcPr>
-          <w:p>
-            <w:pPr>
-              <w:spacing w:after="20" w:line="259" w:lineRule="auto"/>
-            </w:pPr>
-            <w:r>
-              <w:rPr>
-                <w:b w:val="0"/>
-                <w:sz w:val="18"/>
-              </w:rPr>
-              <w:t>planMission  组织计算并生成输出</w:t>
-            </w:r>
-          </w:p>
-        </w:tc>
-      </w:tr>
-      <w:tr>
-        <w:trPr>
-          <w:cantSplit/>
-        </w:trPr>
-        <w:tc>
-          <w:tcPr>
-            <w:tcW w:type="dxa" w:w="3742"/>
+            <w:tcW w:type="dxa" w:w="3685"/>
             <w:vAlign w:val="center"/>
             <w:tcMar>
               <w:top w:w="75" w:type="dxa"/>
@@ -5885,7 +6239,7 @@
         </w:tc>
         <w:tc>
           <w:tcPr>
-            <w:tcW w:type="dxa" w:w="6009"/>
+            <w:tcW w:type="dxa" w:w="6066"/>
             <w:vAlign w:val="center"/>
             <w:tcMar>
               <w:top w:w="75" w:type="dxa"/>
@@ -5904,9 +6258,7 @@
                 <w:b w:val="0"/>
                 <w:sz w:val="18"/>
               </w:rPr>
-              <w:t>接收 {id,ring,options,holes}</w:t>
-              <w:br/>
-              <w:t>返回 {id,plan} 或 {id,error}</w:t>
+              <w:t>异步水平计算  返回任务编号和结果或错误</w:t>
             </w:r>
           </w:p>
         </w:tc>
@@ -5917,7 +6269,7 @@
         </w:trPr>
         <w:tc>
           <w:tcPr>
-            <w:tcW w:type="dxa" w:w="3742"/>
+            <w:tcW w:type="dxa" w:w="3685"/>
             <w:vAlign w:val="center"/>
             <w:tcMar>
               <w:top w:w="75" w:type="dxa"/>
@@ -5936,13 +6288,13 @@
                 <w:b w:val="0"/>
                 <w:sz w:val="18"/>
               </w:rPr>
-              <w:t>src/main.js</w:t>
+              <w:t>src/main.js / src/map.js</w:t>
             </w:r>
           </w:p>
         </w:tc>
         <w:tc>
           <w:tcPr>
-            <w:tcW w:type="dxa" w:w="6009"/>
+            <w:tcW w:type="dxa" w:w="6066"/>
             <w:vAlign w:val="center"/>
             <w:tcMar>
               <w:top w:w="75" w:type="dxa"/>
@@ -5961,7 +6313,62 @@
                 <w:b w:val="0"/>
                 <w:sz w:val="18"/>
               </w:rPr>
-              <w:t>绘制与参数输入  220 ms 防抖  方案保存与导出</w:t>
+              <w:t>机型模式交互  异步地形流程  地图足迹与预览</w:t>
+            </w:r>
+          </w:p>
+        </w:tc>
+      </w:tr>
+      <w:tr>
+        <w:trPr>
+          <w:cantSplit/>
+        </w:trPr>
+        <w:tc>
+          <w:tcPr>
+            <w:tcW w:type="dxa" w:w="3685"/>
+            <w:vAlign w:val="center"/>
+            <w:tcMar>
+              <w:top w:w="75" w:type="dxa"/>
+              <w:bottom w:w="75" w:type="dxa"/>
+              <w:left w:w="75" w:type="dxa"/>
+              <w:right w:w="75" w:type="dxa"/>
+            </w:tcMar>
+            <w:shd w:fill="F4F7FA"/>
+          </w:tcPr>
+          <w:p>
+            <w:pPr>
+              <w:spacing w:after="20" w:line="259" w:lineRule="auto"/>
+            </w:pPr>
+            <w:r>
+              <w:rPr>
+                <w:b w:val="0"/>
+                <w:sz w:val="18"/>
+              </w:rPr>
+              <w:t>docs/algorithm-reference.test.js</w:t>
+            </w:r>
+          </w:p>
+        </w:tc>
+        <w:tc>
+          <w:tcPr>
+            <w:tcW w:type="dxa" w:w="6066"/>
+            <w:vAlign w:val="center"/>
+            <w:tcMar>
+              <w:top w:w="75" w:type="dxa"/>
+              <w:bottom w:w="75" w:type="dxa"/>
+              <w:left w:w="75" w:type="dxa"/>
+              <w:right w:w="75" w:type="dxa"/>
+            </w:tcMar>
+            <w:shd w:fill="F4F7FA"/>
+          </w:tcPr>
+          <w:p>
+            <w:pPr>
+              <w:spacing w:after="20" w:line="259" w:lineRule="auto"/>
+            </w:pPr>
+            <w:r>
+              <w:rPr>
+                <w:b w:val="0"/>
+                <w:sz w:val="18"/>
+              </w:rPr>
+              <w:t>本文矩形与斜坡算例回归验证</w:t>
             </w:r>
           </w:p>
         </w:tc>
@@ -5974,7 +6381,7 @@
     </w:p>
     <w:p>
       <w:r>
-        <w:t>行号对应代码基线 a1c1cb4。网页通过递增任务编号忽略过时的 Worker 返回值，避免旧结果覆盖新参数；这并不取消 Worker 已开始的旧计算。</w:t>
+        <w:t>网页参数修改采用 220 ms 防抖。任务编号贯穿水平计算和地形采样；旧任务后返回时不覆盖新结果。重算立即停用旧导出，地形全部采样成功后才恢复。</w:t>
       </w:r>
     </w:p>
     <w:p>
@@ -5982,12 +6389,12 @@
         <w:pStyle w:val="Heading2"/>
       </w:pPr>
       <w:r>
-        <w:t>相关测试</w:t>
+        <w:t>验证内容</w:t>
       </w:r>
     </w:p>
     <w:p>
       <w:r>
-        <w:t>src/planner.test.js 覆盖投影往返、矩形统计、凹区与孔洞连接、非法几何、屋顶间距、窄区域、双网格、自动航向、容量上限、输入不可变性及细长突出部覆盖等 13 项。docs/algorithm-reference.test.js 对本文矩形算例新增回归验证，约束照片数、航段数、主要统计值和舍入容差。</w:t>
+        <w:t>测试包含多边形与孔洞路径、相机模式限制、左右近似足迹对称性、AGL 与旧参数兼容、固定坡面三维距离、绕行峰值加密、采样限额与失败处理、Terrarium 小数及负高程解码、瓦片接缝、并发缓存和导出高程字段。</w:t>
       </w:r>
     </w:p>
     <w:p>
@@ -5999,7 +6406,7 @@
           <w:rFonts w:ascii="Consolas" w:hAnsi="Consolas"/>
           <w:sz w:val="18"/>
         </w:rPr>
-        <w:t>node --test src/planner.test.js docs/algorithm-reference.test.js</w:t>
+        <w:t>npm test</w:t>
         <w:br/>
         <w:t>npm run build</w:t>
         <w:br/>
@@ -6008,7 +6415,7 @@
     </w:p>
     <w:p>
       <w:r>
-        <w:t>自动测试验证的是实现行为和特定几何样例，不能替代真实场景试飞、影像质量检验或完整的飞行安全校核。修改相机预设、坐标变换或规划算法后，应同步重算本文示例和更新测试。</w:t>
+        <w:t>自动测试约束实现行为，不替代测绘精度检验、飞行性能验证或现场试飞。修改参数或高程流程后应同步重算本文示例。</w:t>
       </w:r>
     </w:p>
     <w:p>
@@ -6016,27 +6423,37 @@
         <w:pStyle w:val="Heading2"/>
       </w:pPr>
       <w:r>
-        <w:t>项目与来源</w:t>
+        <w:t>资料与访问入口</w:t>
       </w:r>
     </w:p>
     <w:p>
       <w:r>
-        <w:t>仓库  https://github.com/marky789/aeroplan-ortho-planner</w:t>
+        <w:t>项目  https://github.com/marky789/aeroplan-ortho-planner</w:t>
       </w:r>
     </w:p>
     <w:p>
       <w:r>
-        <w:t>在线项目  https://marky789.github.io/aeroplan-ortho-planner/</w:t>
+        <w:t>网页  https://marky789.github.io/aeroplan-ortho-planner/</w:t>
       </w:r>
     </w:p>
     <w:p>
       <w:r>
-        <w:t>相机预设在代码中的资料引用  https://enterprise.dji.com/dock-3/specs</w:t>
+        <w:t>地形数据登记  https://registry.opendata.aws/terrain-tiles/</w:t>
       </w:r>
     </w:p>
     <w:p>
       <w:r>
-        <w:t>本文的公式、流程、默认值与接口以项目源代码为准。相机资料链接用于追溯预设来源，实际执行前应匹配设备型号、固件和拍摄模式。</w:t>
+        <w:t>编码与版权  https://github.com/tilezen/joerd/tree/master/docs</w:t>
+      </w:r>
+    </w:p>
+    <w:p>
+      <w:r>
+        <w:t>相机规格  https://enterprise.dji.com/dock-3/specs</w:t>
+      </w:r>
+    </w:p>
+    <w:p>
+      <w:r>
+        <w:t>三向支持与质量提示  DJI Dock 3 Matrice 4D 系列作业指南第 55 页，可从大疆机场 3 官方下载中心获取。侧向 −62.5°、偏航 ±27.5°、横滚 0° 来自本项目用户确认的近似建模参数。</w:t>
       </w:r>
     </w:p>
     <w:sectPr>

</xml_diff>